<commit_message>
commit global pour resynchroniser le projet
</commit_message>
<xml_diff>
--- a/Step 2/S-P_450-E2_anomalies-grp_Matias_Denis.docx
+++ b/Step 2/S-P_450-E2_anomalies-grp_Matias_Denis.docx
@@ -4,305 +4,3126 @@
   <w:body>
     <w:p>
       <w:pPr>
-        <w:pStyle w:val="Titre1"/>
+        <w:rPr>
+          <w:noProof/>
+        </w:rPr>
       </w:pPr>
       <w:r>
-        <w:t>Rapport de mise en place de l’application</w:t>
+        <w:rPr>
+          <w:rFonts w:asciiTheme="majorHAnsi" w:eastAsiaTheme="majorEastAsia" w:hAnsiTheme="majorHAnsi" w:cstheme="majorBidi"/>
+          <w:color w:val="0F4761" w:themeColor="accent1" w:themeShade="BF"/>
+          <w:sz w:val="40"/>
+          <w:szCs w:val="40"/>
+        </w:rPr>
+        <w:t>Analyse des anomalies</w:t>
       </w:r>
     </w:p>
-    <w:p/>
+    <w:tbl>
+      <w:tblPr>
+        <w:tblW w:w="9916" w:type="dxa"/>
+        <w:tblCellMar>
+          <w:left w:w="70" w:type="dxa"/>
+          <w:right w:w="70" w:type="dxa"/>
+        </w:tblCellMar>
+        <w:tblLook w:val="04A0" w:firstRow="1" w:lastRow="0" w:firstColumn="1" w:lastColumn="0" w:noHBand="0" w:noVBand="1"/>
+      </w:tblPr>
+      <w:tblGrid>
+        <w:gridCol w:w="385"/>
+        <w:gridCol w:w="1620"/>
+        <w:gridCol w:w="1681"/>
+        <w:gridCol w:w="1522"/>
+        <w:gridCol w:w="1351"/>
+        <w:gridCol w:w="1314"/>
+        <w:gridCol w:w="997"/>
+        <w:gridCol w:w="1046"/>
+      </w:tblGrid>
+      <w:tr>
+        <w:trPr>
+          <w:trHeight w:val="1215"/>
+        </w:trPr>
+        <w:tc>
+          <w:tcPr>
+            <w:tcW w:w="385" w:type="dxa"/>
+            <w:tcBorders>
+              <w:top w:val="single" w:sz="8" w:space="0" w:color="000000"/>
+              <w:left w:val="single" w:sz="8" w:space="0" w:color="000000"/>
+              <w:bottom w:val="single" w:sz="8" w:space="0" w:color="000000"/>
+              <w:right w:val="single" w:sz="8" w:space="0" w:color="000000"/>
+            </w:tcBorders>
+            <w:shd w:val="clear" w:color="auto" w:fill="auto"/>
+            <w:hideMark/>
+          </w:tcPr>
+          <w:p>
+            <w:pPr>
+              <w:spacing w:after="0" w:line="240" w:lineRule="auto"/>
+              <w:rPr>
+                <w:rFonts w:ascii="Arial" w:eastAsia="Times New Roman" w:hAnsi="Arial" w:cs="Arial"/>
+                <w:b/>
+                <w:bCs/>
+                <w:color w:val="1F1F1F"/>
+                <w:kern w:val="0"/>
+                <w:sz w:val="22"/>
+                <w:szCs w:val="22"/>
+                <w:lang w:eastAsia="fr-CH"/>
+                <w14:ligatures w14:val="none"/>
+              </w:rPr>
+            </w:pPr>
+            <w:r>
+              <w:rPr>
+                <w:rFonts w:ascii="Arial" w:eastAsia="Times New Roman" w:hAnsi="Arial" w:cs="Arial"/>
+                <w:b/>
+                <w:bCs/>
+                <w:color w:val="1F1F1F"/>
+                <w:kern w:val="0"/>
+                <w:sz w:val="22"/>
+                <w:szCs w:val="22"/>
+                <w:lang w:eastAsia="fr-CH"/>
+                <w14:ligatures w14:val="none"/>
+              </w:rPr>
+              <w:t>ID</w:t>
+            </w:r>
+          </w:p>
+        </w:tc>
+        <w:tc>
+          <w:tcPr>
+            <w:tcW w:w="1620" w:type="dxa"/>
+            <w:tcBorders>
+              <w:top w:val="single" w:sz="8" w:space="0" w:color="000000"/>
+              <w:left w:val="nil"/>
+              <w:bottom w:val="single" w:sz="8" w:space="0" w:color="000000"/>
+              <w:right w:val="single" w:sz="8" w:space="0" w:color="000000"/>
+            </w:tcBorders>
+            <w:shd w:val="clear" w:color="auto" w:fill="auto"/>
+            <w:hideMark/>
+          </w:tcPr>
+          <w:p>
+            <w:pPr>
+              <w:spacing w:after="0" w:line="240" w:lineRule="auto"/>
+              <w:rPr>
+                <w:rFonts w:ascii="Arial" w:eastAsia="Times New Roman" w:hAnsi="Arial" w:cs="Arial"/>
+                <w:b/>
+                <w:bCs/>
+                <w:color w:val="1F1F1F"/>
+                <w:kern w:val="0"/>
+                <w:sz w:val="22"/>
+                <w:szCs w:val="22"/>
+                <w:lang w:eastAsia="fr-CH"/>
+                <w14:ligatures w14:val="none"/>
+              </w:rPr>
+            </w:pPr>
+            <w:r>
+              <w:rPr>
+                <w:rFonts w:ascii="Arial" w:eastAsia="Times New Roman" w:hAnsi="Arial" w:cs="Arial"/>
+                <w:b/>
+                <w:bCs/>
+                <w:color w:val="1F1F1F"/>
+                <w:kern w:val="0"/>
+                <w:sz w:val="22"/>
+                <w:szCs w:val="22"/>
+                <w:lang w:eastAsia="fr-CH"/>
+                <w14:ligatures w14:val="none"/>
+              </w:rPr>
+              <w:t>Description</w:t>
+            </w:r>
+          </w:p>
+        </w:tc>
+        <w:tc>
+          <w:tcPr>
+            <w:tcW w:w="1681" w:type="dxa"/>
+            <w:tcBorders>
+              <w:top w:val="single" w:sz="8" w:space="0" w:color="000000"/>
+              <w:left w:val="nil"/>
+              <w:bottom w:val="single" w:sz="8" w:space="0" w:color="000000"/>
+              <w:right w:val="single" w:sz="8" w:space="0" w:color="000000"/>
+            </w:tcBorders>
+            <w:shd w:val="clear" w:color="auto" w:fill="auto"/>
+            <w:hideMark/>
+          </w:tcPr>
+          <w:p>
+            <w:pPr>
+              <w:spacing w:after="0" w:line="240" w:lineRule="auto"/>
+              <w:rPr>
+                <w:rFonts w:ascii="Arial" w:eastAsia="Times New Roman" w:hAnsi="Arial" w:cs="Arial"/>
+                <w:b/>
+                <w:bCs/>
+                <w:color w:val="1F1F1F"/>
+                <w:kern w:val="0"/>
+                <w:sz w:val="22"/>
+                <w:szCs w:val="22"/>
+                <w:lang w:eastAsia="fr-CH"/>
+                <w14:ligatures w14:val="none"/>
+              </w:rPr>
+            </w:pPr>
+            <w:r>
+              <w:rPr>
+                <w:rFonts w:ascii="Arial" w:eastAsia="Times New Roman" w:hAnsi="Arial" w:cs="Arial"/>
+                <w:b/>
+                <w:bCs/>
+                <w:color w:val="1F1F1F"/>
+                <w:kern w:val="0"/>
+                <w:sz w:val="22"/>
+                <w:szCs w:val="22"/>
+                <w:lang w:eastAsia="fr-CH"/>
+                <w14:ligatures w14:val="none"/>
+              </w:rPr>
+              <w:t>Étapes de reproduction</w:t>
+            </w:r>
+          </w:p>
+        </w:tc>
+        <w:tc>
+          <w:tcPr>
+            <w:tcW w:w="1522" w:type="dxa"/>
+            <w:tcBorders>
+              <w:top w:val="single" w:sz="8" w:space="0" w:color="000000"/>
+              <w:left w:val="nil"/>
+              <w:bottom w:val="single" w:sz="8" w:space="0" w:color="000000"/>
+              <w:right w:val="single" w:sz="8" w:space="0" w:color="000000"/>
+            </w:tcBorders>
+            <w:shd w:val="clear" w:color="auto" w:fill="auto"/>
+            <w:hideMark/>
+          </w:tcPr>
+          <w:p>
+            <w:pPr>
+              <w:spacing w:after="0" w:line="240" w:lineRule="auto"/>
+              <w:rPr>
+                <w:rFonts w:ascii="Arial" w:eastAsia="Times New Roman" w:hAnsi="Arial" w:cs="Arial"/>
+                <w:b/>
+                <w:bCs/>
+                <w:color w:val="1F1F1F"/>
+                <w:kern w:val="0"/>
+                <w:sz w:val="22"/>
+                <w:szCs w:val="22"/>
+                <w:lang w:eastAsia="fr-CH"/>
+                <w14:ligatures w14:val="none"/>
+              </w:rPr>
+            </w:pPr>
+            <w:r>
+              <w:rPr>
+                <w:rFonts w:ascii="Arial" w:eastAsia="Times New Roman" w:hAnsi="Arial" w:cs="Arial"/>
+                <w:b/>
+                <w:bCs/>
+                <w:color w:val="1F1F1F"/>
+                <w:kern w:val="0"/>
+                <w:sz w:val="22"/>
+                <w:szCs w:val="22"/>
+                <w:lang w:eastAsia="fr-CH"/>
+                <w14:ligatures w14:val="none"/>
+              </w:rPr>
+              <w:t>Résultat attendu</w:t>
+            </w:r>
+          </w:p>
+        </w:tc>
+        <w:tc>
+          <w:tcPr>
+            <w:tcW w:w="1351" w:type="dxa"/>
+            <w:tcBorders>
+              <w:top w:val="single" w:sz="8" w:space="0" w:color="000000"/>
+              <w:left w:val="nil"/>
+              <w:bottom w:val="single" w:sz="8" w:space="0" w:color="000000"/>
+              <w:right w:val="single" w:sz="8" w:space="0" w:color="000000"/>
+            </w:tcBorders>
+            <w:shd w:val="clear" w:color="auto" w:fill="auto"/>
+            <w:hideMark/>
+          </w:tcPr>
+          <w:p>
+            <w:pPr>
+              <w:spacing w:after="0" w:line="240" w:lineRule="auto"/>
+              <w:rPr>
+                <w:rFonts w:ascii="Arial" w:eastAsia="Times New Roman" w:hAnsi="Arial" w:cs="Arial"/>
+                <w:b/>
+                <w:bCs/>
+                <w:color w:val="1F1F1F"/>
+                <w:kern w:val="0"/>
+                <w:sz w:val="22"/>
+                <w:szCs w:val="22"/>
+                <w:lang w:eastAsia="fr-CH"/>
+                <w14:ligatures w14:val="none"/>
+              </w:rPr>
+            </w:pPr>
+            <w:r>
+              <w:rPr>
+                <w:rFonts w:ascii="Arial" w:eastAsia="Times New Roman" w:hAnsi="Arial" w:cs="Arial"/>
+                <w:b/>
+                <w:bCs/>
+                <w:color w:val="1F1F1F"/>
+                <w:kern w:val="0"/>
+                <w:sz w:val="22"/>
+                <w:szCs w:val="22"/>
+                <w:lang w:eastAsia="fr-CH"/>
+                <w14:ligatures w14:val="none"/>
+              </w:rPr>
+              <w:t>Résultat observé</w:t>
+            </w:r>
+          </w:p>
+        </w:tc>
+        <w:tc>
+          <w:tcPr>
+            <w:tcW w:w="1314" w:type="dxa"/>
+            <w:tcBorders>
+              <w:top w:val="single" w:sz="8" w:space="0" w:color="000000"/>
+              <w:left w:val="nil"/>
+              <w:bottom w:val="single" w:sz="8" w:space="0" w:color="000000"/>
+              <w:right w:val="single" w:sz="8" w:space="0" w:color="000000"/>
+            </w:tcBorders>
+            <w:shd w:val="clear" w:color="auto" w:fill="auto"/>
+            <w:hideMark/>
+          </w:tcPr>
+          <w:p>
+            <w:pPr>
+              <w:spacing w:after="0" w:line="240" w:lineRule="auto"/>
+              <w:rPr>
+                <w:rFonts w:ascii="Arial" w:eastAsia="Times New Roman" w:hAnsi="Arial" w:cs="Arial"/>
+                <w:b/>
+                <w:bCs/>
+                <w:color w:val="1F1F1F"/>
+                <w:kern w:val="0"/>
+                <w:sz w:val="22"/>
+                <w:szCs w:val="22"/>
+                <w:lang w:eastAsia="fr-CH"/>
+                <w14:ligatures w14:val="none"/>
+              </w:rPr>
+            </w:pPr>
+            <w:r>
+              <w:rPr>
+                <w:rFonts w:ascii="Arial" w:eastAsia="Times New Roman" w:hAnsi="Arial" w:cs="Arial"/>
+                <w:b/>
+                <w:bCs/>
+                <w:color w:val="1F1F1F"/>
+                <w:kern w:val="0"/>
+                <w:sz w:val="22"/>
+                <w:szCs w:val="22"/>
+                <w:lang w:eastAsia="fr-CH"/>
+                <w14:ligatures w14:val="none"/>
+              </w:rPr>
+              <w:t>Gravité</w:t>
+            </w:r>
+          </w:p>
+        </w:tc>
+        <w:tc>
+          <w:tcPr>
+            <w:tcW w:w="997" w:type="dxa"/>
+            <w:tcBorders>
+              <w:top w:val="single" w:sz="8" w:space="0" w:color="000000"/>
+              <w:left w:val="nil"/>
+              <w:bottom w:val="single" w:sz="8" w:space="0" w:color="000000"/>
+              <w:right w:val="single" w:sz="8" w:space="0" w:color="000000"/>
+            </w:tcBorders>
+            <w:shd w:val="clear" w:color="auto" w:fill="auto"/>
+            <w:hideMark/>
+          </w:tcPr>
+          <w:p>
+            <w:pPr>
+              <w:spacing w:after="0" w:line="240" w:lineRule="auto"/>
+              <w:rPr>
+                <w:rFonts w:ascii="Arial" w:eastAsia="Times New Roman" w:hAnsi="Arial" w:cs="Arial"/>
+                <w:b/>
+                <w:bCs/>
+                <w:color w:val="1F1F1F"/>
+                <w:kern w:val="0"/>
+                <w:sz w:val="22"/>
+                <w:szCs w:val="22"/>
+                <w:lang w:eastAsia="fr-CH"/>
+                <w14:ligatures w14:val="none"/>
+              </w:rPr>
+            </w:pPr>
+            <w:r>
+              <w:rPr>
+                <w:rFonts w:ascii="Arial" w:eastAsia="Times New Roman" w:hAnsi="Arial" w:cs="Arial"/>
+                <w:b/>
+                <w:bCs/>
+                <w:color w:val="1F1F1F"/>
+                <w:kern w:val="0"/>
+                <w:sz w:val="22"/>
+                <w:szCs w:val="22"/>
+                <w:lang w:eastAsia="fr-CH"/>
+                <w14:ligatures w14:val="none"/>
+              </w:rPr>
+              <w:t>Sévérité</w:t>
+            </w:r>
+          </w:p>
+        </w:tc>
+        <w:tc>
+          <w:tcPr>
+            <w:tcW w:w="1046" w:type="dxa"/>
+            <w:tcBorders>
+              <w:top w:val="single" w:sz="8" w:space="0" w:color="000000"/>
+              <w:left w:val="nil"/>
+              <w:bottom w:val="single" w:sz="8" w:space="0" w:color="000000"/>
+              <w:right w:val="single" w:sz="8" w:space="0" w:color="000000"/>
+            </w:tcBorders>
+            <w:shd w:val="clear" w:color="auto" w:fill="auto"/>
+            <w:hideMark/>
+          </w:tcPr>
+          <w:p>
+            <w:pPr>
+              <w:spacing w:after="0" w:line="240" w:lineRule="auto"/>
+              <w:rPr>
+                <w:rFonts w:ascii="Arial" w:eastAsia="Times New Roman" w:hAnsi="Arial" w:cs="Arial"/>
+                <w:b/>
+                <w:bCs/>
+                <w:color w:val="1F1F1F"/>
+                <w:kern w:val="0"/>
+                <w:sz w:val="22"/>
+                <w:szCs w:val="22"/>
+                <w:lang w:eastAsia="fr-CH"/>
+                <w14:ligatures w14:val="none"/>
+              </w:rPr>
+            </w:pPr>
+            <w:r>
+              <w:rPr>
+                <w:rFonts w:ascii="Arial" w:eastAsia="Times New Roman" w:hAnsi="Arial" w:cs="Arial"/>
+                <w:b/>
+                <w:bCs/>
+                <w:color w:val="1F1F1F"/>
+                <w:kern w:val="0"/>
+                <w:sz w:val="22"/>
+                <w:szCs w:val="22"/>
+                <w:lang w:eastAsia="fr-CH"/>
+                <w14:ligatures w14:val="none"/>
+              </w:rPr>
+              <w:t>Priorité</w:t>
+            </w:r>
+          </w:p>
+        </w:tc>
+      </w:tr>
+      <w:tr>
+        <w:trPr>
+          <w:trHeight w:val="2580"/>
+        </w:trPr>
+        <w:tc>
+          <w:tcPr>
+            <w:tcW w:w="385" w:type="dxa"/>
+            <w:tcBorders>
+              <w:top w:val="nil"/>
+              <w:left w:val="single" w:sz="8" w:space="0" w:color="000000"/>
+              <w:bottom w:val="single" w:sz="8" w:space="0" w:color="000000"/>
+              <w:right w:val="single" w:sz="8" w:space="0" w:color="000000"/>
+            </w:tcBorders>
+            <w:shd w:val="clear" w:color="auto" w:fill="auto"/>
+            <w:hideMark/>
+          </w:tcPr>
+          <w:p>
+            <w:pPr>
+              <w:spacing w:after="0" w:line="240" w:lineRule="auto"/>
+              <w:rPr>
+                <w:rFonts w:ascii="Arial" w:eastAsia="Times New Roman" w:hAnsi="Arial" w:cs="Arial"/>
+                <w:b/>
+                <w:bCs/>
+                <w:color w:val="1F1F1F"/>
+                <w:kern w:val="0"/>
+                <w:sz w:val="22"/>
+                <w:szCs w:val="22"/>
+                <w:lang w:eastAsia="fr-CH"/>
+                <w14:ligatures w14:val="none"/>
+              </w:rPr>
+            </w:pPr>
+            <w:r>
+              <w:rPr>
+                <w:rFonts w:ascii="Arial" w:eastAsia="Times New Roman" w:hAnsi="Arial" w:cs="Arial"/>
+                <w:b/>
+                <w:bCs/>
+                <w:color w:val="1F1F1F"/>
+                <w:kern w:val="0"/>
+                <w:sz w:val="22"/>
+                <w:szCs w:val="22"/>
+                <w:lang w:eastAsia="fr-CH"/>
+                <w14:ligatures w14:val="none"/>
+              </w:rPr>
+              <w:t>B-01</w:t>
+            </w:r>
+          </w:p>
+        </w:tc>
+        <w:tc>
+          <w:tcPr>
+            <w:tcW w:w="1620" w:type="dxa"/>
+            <w:tcBorders>
+              <w:top w:val="nil"/>
+              <w:left w:val="nil"/>
+              <w:bottom w:val="single" w:sz="8" w:space="0" w:color="000000"/>
+              <w:right w:val="single" w:sz="8" w:space="0" w:color="000000"/>
+            </w:tcBorders>
+            <w:shd w:val="clear" w:color="auto" w:fill="auto"/>
+            <w:hideMark/>
+          </w:tcPr>
+          <w:p>
+            <w:pPr>
+              <w:spacing w:after="0" w:line="240" w:lineRule="auto"/>
+              <w:rPr>
+                <w:rFonts w:ascii="Arial" w:eastAsia="Times New Roman" w:hAnsi="Arial" w:cs="Arial"/>
+                <w:b/>
+                <w:bCs/>
+                <w:color w:val="1F1F1F"/>
+                <w:kern w:val="0"/>
+                <w:sz w:val="22"/>
+                <w:szCs w:val="22"/>
+                <w:lang w:eastAsia="fr-CH"/>
+                <w14:ligatures w14:val="none"/>
+              </w:rPr>
+            </w:pPr>
+            <w:r>
+              <w:rPr>
+                <w:rFonts w:ascii="Arial" w:eastAsia="Times New Roman" w:hAnsi="Arial" w:cs="Arial"/>
+                <w:b/>
+                <w:bCs/>
+                <w:color w:val="1F1F1F"/>
+                <w:kern w:val="0"/>
+                <w:sz w:val="22"/>
+                <w:szCs w:val="22"/>
+                <w:lang w:eastAsia="fr-CH"/>
+                <w14:ligatures w14:val="none"/>
+              </w:rPr>
+              <w:t>Doublon visuel lors de la création</w:t>
+            </w:r>
+          </w:p>
+        </w:tc>
+        <w:tc>
+          <w:tcPr>
+            <w:tcW w:w="1681" w:type="dxa"/>
+            <w:tcBorders>
+              <w:top w:val="nil"/>
+              <w:left w:val="nil"/>
+              <w:bottom w:val="single" w:sz="8" w:space="0" w:color="000000"/>
+              <w:right w:val="single" w:sz="8" w:space="0" w:color="000000"/>
+            </w:tcBorders>
+            <w:shd w:val="clear" w:color="auto" w:fill="auto"/>
+            <w:hideMark/>
+          </w:tcPr>
+          <w:p>
+            <w:pPr>
+              <w:spacing w:after="0" w:line="240" w:lineRule="auto"/>
+              <w:rPr>
+                <w:rFonts w:ascii="Arial" w:eastAsia="Times New Roman" w:hAnsi="Arial" w:cs="Arial"/>
+                <w:color w:val="1F1F1F"/>
+                <w:kern w:val="0"/>
+                <w:sz w:val="22"/>
+                <w:szCs w:val="22"/>
+                <w:lang w:eastAsia="fr-CH"/>
+                <w14:ligatures w14:val="none"/>
+              </w:rPr>
+            </w:pPr>
+            <w:r>
+              <w:rPr>
+                <w:rFonts w:ascii="Arial" w:eastAsia="Times New Roman" w:hAnsi="Arial" w:cs="Arial"/>
+                <w:color w:val="1F1F1F"/>
+                <w:kern w:val="0"/>
+                <w:sz w:val="22"/>
+                <w:szCs w:val="22"/>
+                <w:lang w:eastAsia="fr-CH"/>
+                <w14:ligatures w14:val="none"/>
+              </w:rPr>
+              <w:t>1. Saisir une tâche et cliquer sur "+ Ajouter". 2. Observer la liste des tâches.</w:t>
+            </w:r>
+          </w:p>
+        </w:tc>
+        <w:tc>
+          <w:tcPr>
+            <w:tcW w:w="1522" w:type="dxa"/>
+            <w:tcBorders>
+              <w:top w:val="nil"/>
+              <w:left w:val="nil"/>
+              <w:bottom w:val="single" w:sz="8" w:space="0" w:color="000000"/>
+              <w:right w:val="single" w:sz="8" w:space="0" w:color="000000"/>
+            </w:tcBorders>
+            <w:shd w:val="clear" w:color="auto" w:fill="auto"/>
+            <w:hideMark/>
+          </w:tcPr>
+          <w:p>
+            <w:pPr>
+              <w:spacing w:after="0" w:line="240" w:lineRule="auto"/>
+              <w:rPr>
+                <w:rFonts w:ascii="Arial" w:eastAsia="Times New Roman" w:hAnsi="Arial" w:cs="Arial"/>
+                <w:color w:val="1F1F1F"/>
+                <w:kern w:val="0"/>
+                <w:sz w:val="22"/>
+                <w:szCs w:val="22"/>
+                <w:lang w:eastAsia="fr-CH"/>
+                <w14:ligatures w14:val="none"/>
+              </w:rPr>
+            </w:pPr>
+            <w:r>
+              <w:rPr>
+                <w:rFonts w:ascii="Arial" w:eastAsia="Times New Roman" w:hAnsi="Arial" w:cs="Arial"/>
+                <w:color w:val="1F1F1F"/>
+                <w:kern w:val="0"/>
+                <w:sz w:val="22"/>
+                <w:szCs w:val="22"/>
+                <w:lang w:eastAsia="fr-CH"/>
+                <w14:ligatures w14:val="none"/>
+              </w:rPr>
+              <w:t>La tâche apparaît une seule fois après confirmation de l'API.</w:t>
+            </w:r>
+          </w:p>
+        </w:tc>
+        <w:tc>
+          <w:tcPr>
+            <w:tcW w:w="1351" w:type="dxa"/>
+            <w:tcBorders>
+              <w:top w:val="nil"/>
+              <w:left w:val="nil"/>
+              <w:bottom w:val="single" w:sz="8" w:space="0" w:color="000000"/>
+              <w:right w:val="single" w:sz="8" w:space="0" w:color="000000"/>
+            </w:tcBorders>
+            <w:shd w:val="clear" w:color="auto" w:fill="auto"/>
+            <w:hideMark/>
+          </w:tcPr>
+          <w:p>
+            <w:pPr>
+              <w:spacing w:after="0" w:line="240" w:lineRule="auto"/>
+              <w:rPr>
+                <w:rFonts w:ascii="Arial" w:eastAsia="Times New Roman" w:hAnsi="Arial" w:cs="Arial"/>
+                <w:color w:val="1F1F1F"/>
+                <w:kern w:val="0"/>
+                <w:sz w:val="22"/>
+                <w:szCs w:val="22"/>
+                <w:lang w:eastAsia="fr-CH"/>
+                <w14:ligatures w14:val="none"/>
+              </w:rPr>
+            </w:pPr>
+            <w:r>
+              <w:rPr>
+                <w:rFonts w:ascii="Arial" w:eastAsia="Times New Roman" w:hAnsi="Arial" w:cs="Arial"/>
+                <w:color w:val="1F1F1F"/>
+                <w:kern w:val="0"/>
+                <w:sz w:val="22"/>
+                <w:szCs w:val="22"/>
+                <w:lang w:eastAsia="fr-CH"/>
+                <w14:ligatures w14:val="none"/>
+              </w:rPr>
+              <w:t>La tâche apparaît en double (version optimiste + version réelle).</w:t>
+            </w:r>
+          </w:p>
+        </w:tc>
+        <w:tc>
+          <w:tcPr>
+            <w:tcW w:w="1314" w:type="dxa"/>
+            <w:tcBorders>
+              <w:top w:val="nil"/>
+              <w:left w:val="nil"/>
+              <w:bottom w:val="single" w:sz="8" w:space="0" w:color="000000"/>
+              <w:right w:val="single" w:sz="8" w:space="0" w:color="000000"/>
+            </w:tcBorders>
+            <w:shd w:val="clear" w:color="auto" w:fill="auto"/>
+            <w:hideMark/>
+          </w:tcPr>
+          <w:p>
+            <w:pPr>
+              <w:spacing w:after="0" w:line="240" w:lineRule="auto"/>
+              <w:rPr>
+                <w:rFonts w:ascii="Arial" w:eastAsia="Times New Roman" w:hAnsi="Arial" w:cs="Arial"/>
+                <w:color w:val="1F1F1F"/>
+                <w:kern w:val="0"/>
+                <w:sz w:val="22"/>
+                <w:szCs w:val="22"/>
+                <w:lang w:eastAsia="fr-CH"/>
+                <w14:ligatures w14:val="none"/>
+              </w:rPr>
+            </w:pPr>
+            <w:r>
+              <w:rPr>
+                <w:rFonts w:ascii="Arial" w:eastAsia="Times New Roman" w:hAnsi="Arial" w:cs="Arial"/>
+                <w:color w:val="1F1F1F"/>
+                <w:kern w:val="0"/>
+                <w:sz w:val="22"/>
+                <w:szCs w:val="22"/>
+                <w:lang w:eastAsia="fr-CH"/>
+                <w14:ligatures w14:val="none"/>
+              </w:rPr>
+              <w:t>Mineure</w:t>
+            </w:r>
+          </w:p>
+        </w:tc>
+        <w:tc>
+          <w:tcPr>
+            <w:tcW w:w="997" w:type="dxa"/>
+            <w:tcBorders>
+              <w:top w:val="nil"/>
+              <w:left w:val="nil"/>
+              <w:bottom w:val="single" w:sz="8" w:space="0" w:color="000000"/>
+              <w:right w:val="single" w:sz="8" w:space="0" w:color="000000"/>
+            </w:tcBorders>
+            <w:shd w:val="clear" w:color="auto" w:fill="auto"/>
+            <w:hideMark/>
+          </w:tcPr>
+          <w:p>
+            <w:pPr>
+              <w:spacing w:after="0" w:line="240" w:lineRule="auto"/>
+              <w:rPr>
+                <w:rFonts w:ascii="Arial" w:eastAsia="Times New Roman" w:hAnsi="Arial" w:cs="Arial"/>
+                <w:color w:val="1F1F1F"/>
+                <w:kern w:val="0"/>
+                <w:sz w:val="22"/>
+                <w:szCs w:val="22"/>
+                <w:lang w:eastAsia="fr-CH"/>
+                <w14:ligatures w14:val="none"/>
+              </w:rPr>
+            </w:pPr>
+            <w:r>
+              <w:rPr>
+                <w:rFonts w:ascii="Arial" w:eastAsia="Times New Roman" w:hAnsi="Arial" w:cs="Arial"/>
+                <w:color w:val="1F1F1F"/>
+                <w:kern w:val="0"/>
+                <w:sz w:val="22"/>
+                <w:szCs w:val="22"/>
+                <w:lang w:eastAsia="fr-CH"/>
+                <w14:ligatures w14:val="none"/>
+              </w:rPr>
+              <w:t>Majeure</w:t>
+            </w:r>
+          </w:p>
+        </w:tc>
+        <w:tc>
+          <w:tcPr>
+            <w:tcW w:w="1046" w:type="dxa"/>
+            <w:tcBorders>
+              <w:top w:val="nil"/>
+              <w:left w:val="nil"/>
+              <w:bottom w:val="single" w:sz="8" w:space="0" w:color="000000"/>
+              <w:right w:val="single" w:sz="8" w:space="0" w:color="000000"/>
+            </w:tcBorders>
+            <w:shd w:val="clear" w:color="auto" w:fill="auto"/>
+            <w:hideMark/>
+          </w:tcPr>
+          <w:p>
+            <w:pPr>
+              <w:spacing w:after="0" w:line="240" w:lineRule="auto"/>
+              <w:rPr>
+                <w:rFonts w:ascii="Arial" w:eastAsia="Times New Roman" w:hAnsi="Arial" w:cs="Arial"/>
+                <w:color w:val="1F1F1F"/>
+                <w:kern w:val="0"/>
+                <w:sz w:val="22"/>
+                <w:szCs w:val="22"/>
+                <w:lang w:eastAsia="fr-CH"/>
+                <w14:ligatures w14:val="none"/>
+              </w:rPr>
+            </w:pPr>
+            <w:r>
+              <w:rPr>
+                <w:rFonts w:ascii="Arial" w:eastAsia="Times New Roman" w:hAnsi="Arial" w:cs="Arial"/>
+                <w:color w:val="1F1F1F"/>
+                <w:kern w:val="0"/>
+                <w:sz w:val="22"/>
+                <w:szCs w:val="22"/>
+                <w:lang w:eastAsia="fr-CH"/>
+                <w14:ligatures w14:val="none"/>
+              </w:rPr>
+              <w:t>Haute</w:t>
+            </w:r>
+          </w:p>
+        </w:tc>
+      </w:tr>
+      <w:tr>
+        <w:trPr>
+          <w:trHeight w:val="3720"/>
+        </w:trPr>
+        <w:tc>
+          <w:tcPr>
+            <w:tcW w:w="385" w:type="dxa"/>
+            <w:tcBorders>
+              <w:top w:val="nil"/>
+              <w:left w:val="single" w:sz="8" w:space="0" w:color="000000"/>
+              <w:bottom w:val="single" w:sz="8" w:space="0" w:color="000000"/>
+              <w:right w:val="single" w:sz="8" w:space="0" w:color="000000"/>
+            </w:tcBorders>
+            <w:shd w:val="clear" w:color="auto" w:fill="auto"/>
+            <w:hideMark/>
+          </w:tcPr>
+          <w:p>
+            <w:pPr>
+              <w:spacing w:after="0" w:line="240" w:lineRule="auto"/>
+              <w:rPr>
+                <w:rFonts w:ascii="Arial" w:eastAsia="Times New Roman" w:hAnsi="Arial" w:cs="Arial"/>
+                <w:b/>
+                <w:bCs/>
+                <w:color w:val="1F1F1F"/>
+                <w:kern w:val="0"/>
+                <w:sz w:val="22"/>
+                <w:szCs w:val="22"/>
+                <w:lang w:eastAsia="fr-CH"/>
+                <w14:ligatures w14:val="none"/>
+              </w:rPr>
+            </w:pPr>
+            <w:r>
+              <w:rPr>
+                <w:rFonts w:ascii="Arial" w:eastAsia="Times New Roman" w:hAnsi="Arial" w:cs="Arial"/>
+                <w:b/>
+                <w:bCs/>
+                <w:color w:val="1F1F1F"/>
+                <w:kern w:val="0"/>
+                <w:sz w:val="22"/>
+                <w:szCs w:val="22"/>
+                <w:lang w:eastAsia="fr-CH"/>
+                <w14:ligatures w14:val="none"/>
+              </w:rPr>
+              <w:t>B-02</w:t>
+            </w:r>
+          </w:p>
+        </w:tc>
+        <w:tc>
+          <w:tcPr>
+            <w:tcW w:w="1620" w:type="dxa"/>
+            <w:tcBorders>
+              <w:top w:val="nil"/>
+              <w:left w:val="nil"/>
+              <w:bottom w:val="single" w:sz="8" w:space="0" w:color="000000"/>
+              <w:right w:val="single" w:sz="8" w:space="0" w:color="000000"/>
+            </w:tcBorders>
+            <w:shd w:val="clear" w:color="auto" w:fill="auto"/>
+            <w:hideMark/>
+          </w:tcPr>
+          <w:p>
+            <w:pPr>
+              <w:spacing w:after="0" w:line="240" w:lineRule="auto"/>
+              <w:rPr>
+                <w:rFonts w:ascii="Arial" w:eastAsia="Times New Roman" w:hAnsi="Arial" w:cs="Arial"/>
+                <w:b/>
+                <w:bCs/>
+                <w:color w:val="1F1F1F"/>
+                <w:kern w:val="0"/>
+                <w:sz w:val="22"/>
+                <w:szCs w:val="22"/>
+                <w:lang w:eastAsia="fr-CH"/>
+                <w14:ligatures w14:val="none"/>
+              </w:rPr>
+            </w:pPr>
+            <w:r>
+              <w:rPr>
+                <w:rFonts w:ascii="Arial" w:eastAsia="Times New Roman" w:hAnsi="Arial" w:cs="Arial"/>
+                <w:b/>
+                <w:bCs/>
+                <w:color w:val="1F1F1F"/>
+                <w:kern w:val="0"/>
+                <w:sz w:val="22"/>
+                <w:szCs w:val="22"/>
+                <w:lang w:eastAsia="fr-CH"/>
+                <w14:ligatures w14:val="none"/>
+              </w:rPr>
+              <w:t>Échec de mise à jour de la priorité</w:t>
+            </w:r>
+          </w:p>
+        </w:tc>
+        <w:tc>
+          <w:tcPr>
+            <w:tcW w:w="1681" w:type="dxa"/>
+            <w:tcBorders>
+              <w:top w:val="nil"/>
+              <w:left w:val="nil"/>
+              <w:bottom w:val="single" w:sz="8" w:space="0" w:color="000000"/>
+              <w:right w:val="single" w:sz="8" w:space="0" w:color="000000"/>
+            </w:tcBorders>
+            <w:shd w:val="clear" w:color="auto" w:fill="auto"/>
+            <w:hideMark/>
+          </w:tcPr>
+          <w:p>
+            <w:pPr>
+              <w:spacing w:after="0" w:line="240" w:lineRule="auto"/>
+              <w:rPr>
+                <w:rFonts w:ascii="Arial" w:eastAsia="Times New Roman" w:hAnsi="Arial" w:cs="Arial"/>
+                <w:color w:val="1F1F1F"/>
+                <w:kern w:val="0"/>
+                <w:sz w:val="22"/>
+                <w:szCs w:val="22"/>
+                <w:lang w:eastAsia="fr-CH"/>
+                <w14:ligatures w14:val="none"/>
+              </w:rPr>
+            </w:pPr>
+            <w:r>
+              <w:rPr>
+                <w:rFonts w:ascii="Arial" w:eastAsia="Times New Roman" w:hAnsi="Arial" w:cs="Arial"/>
+                <w:color w:val="1F1F1F"/>
+                <w:kern w:val="0"/>
+                <w:sz w:val="22"/>
+                <w:szCs w:val="22"/>
+                <w:lang w:eastAsia="fr-CH"/>
+                <w14:ligatures w14:val="none"/>
+              </w:rPr>
+              <w:t>1. Cliquer sur "Modifier" sur une tâche existante. 2. Changer la priorité et cliquer sur "Enregistrer".</w:t>
+            </w:r>
+          </w:p>
+        </w:tc>
+        <w:tc>
+          <w:tcPr>
+            <w:tcW w:w="1522" w:type="dxa"/>
+            <w:tcBorders>
+              <w:top w:val="nil"/>
+              <w:left w:val="nil"/>
+              <w:bottom w:val="single" w:sz="8" w:space="0" w:color="000000"/>
+              <w:right w:val="single" w:sz="8" w:space="0" w:color="000000"/>
+            </w:tcBorders>
+            <w:shd w:val="clear" w:color="auto" w:fill="auto"/>
+            <w:hideMark/>
+          </w:tcPr>
+          <w:p>
+            <w:pPr>
+              <w:spacing w:after="0" w:line="240" w:lineRule="auto"/>
+              <w:rPr>
+                <w:rFonts w:ascii="Arial" w:eastAsia="Times New Roman" w:hAnsi="Arial" w:cs="Arial"/>
+                <w:color w:val="1F1F1F"/>
+                <w:kern w:val="0"/>
+                <w:sz w:val="22"/>
+                <w:szCs w:val="22"/>
+                <w:lang w:eastAsia="fr-CH"/>
+                <w14:ligatures w14:val="none"/>
+              </w:rPr>
+            </w:pPr>
+            <w:r>
+              <w:rPr>
+                <w:rFonts w:ascii="Arial" w:eastAsia="Times New Roman" w:hAnsi="Arial" w:cs="Arial"/>
+                <w:color w:val="1F1F1F"/>
+                <w:kern w:val="0"/>
+                <w:sz w:val="22"/>
+                <w:szCs w:val="22"/>
+                <w:lang w:eastAsia="fr-CH"/>
+                <w14:ligatures w14:val="none"/>
+              </w:rPr>
+              <w:t>La priorité est mise à jour sur le serveur et l'UI.</w:t>
+            </w:r>
+          </w:p>
+        </w:tc>
+        <w:tc>
+          <w:tcPr>
+            <w:tcW w:w="1351" w:type="dxa"/>
+            <w:tcBorders>
+              <w:top w:val="nil"/>
+              <w:left w:val="nil"/>
+              <w:bottom w:val="single" w:sz="8" w:space="0" w:color="000000"/>
+              <w:right w:val="single" w:sz="8" w:space="0" w:color="000000"/>
+            </w:tcBorders>
+            <w:shd w:val="clear" w:color="auto" w:fill="auto"/>
+            <w:hideMark/>
+          </w:tcPr>
+          <w:p>
+            <w:pPr>
+              <w:spacing w:after="0" w:line="240" w:lineRule="auto"/>
+              <w:rPr>
+                <w:rFonts w:ascii="Arial" w:eastAsia="Times New Roman" w:hAnsi="Arial" w:cs="Arial"/>
+                <w:color w:val="1F1F1F"/>
+                <w:kern w:val="0"/>
+                <w:sz w:val="22"/>
+                <w:szCs w:val="22"/>
+                <w:lang w:eastAsia="fr-CH"/>
+                <w14:ligatures w14:val="none"/>
+              </w:rPr>
+            </w:pPr>
+            <w:r>
+              <w:rPr>
+                <w:rFonts w:ascii="Arial" w:eastAsia="Times New Roman" w:hAnsi="Arial" w:cs="Arial"/>
+                <w:color w:val="1F1F1F"/>
+                <w:kern w:val="0"/>
+                <w:sz w:val="22"/>
+                <w:szCs w:val="22"/>
+                <w:lang w:eastAsia="fr-CH"/>
+                <w14:ligatures w14:val="none"/>
+              </w:rPr>
+              <w:t>L'API rejette la mise à jour car le frontend envoie le label ("Moyenne") au lieu de la clé ("medium").</w:t>
+            </w:r>
+          </w:p>
+        </w:tc>
+        <w:tc>
+          <w:tcPr>
+            <w:tcW w:w="1314" w:type="dxa"/>
+            <w:tcBorders>
+              <w:top w:val="nil"/>
+              <w:left w:val="nil"/>
+              <w:bottom w:val="single" w:sz="8" w:space="0" w:color="000000"/>
+              <w:right w:val="single" w:sz="8" w:space="0" w:color="000000"/>
+            </w:tcBorders>
+            <w:shd w:val="clear" w:color="auto" w:fill="auto"/>
+            <w:hideMark/>
+          </w:tcPr>
+          <w:p>
+            <w:pPr>
+              <w:spacing w:after="0" w:line="240" w:lineRule="auto"/>
+              <w:rPr>
+                <w:rFonts w:ascii="Arial" w:eastAsia="Times New Roman" w:hAnsi="Arial" w:cs="Arial"/>
+                <w:color w:val="1F1F1F"/>
+                <w:kern w:val="0"/>
+                <w:sz w:val="22"/>
+                <w:szCs w:val="22"/>
+                <w:lang w:eastAsia="fr-CH"/>
+                <w14:ligatures w14:val="none"/>
+              </w:rPr>
+            </w:pPr>
+            <w:r>
+              <w:rPr>
+                <w:rFonts w:ascii="Arial" w:eastAsia="Times New Roman" w:hAnsi="Arial" w:cs="Arial"/>
+                <w:color w:val="1F1F1F"/>
+                <w:kern w:val="0"/>
+                <w:sz w:val="22"/>
+                <w:szCs w:val="22"/>
+                <w:lang w:eastAsia="fr-CH"/>
+                <w14:ligatures w14:val="none"/>
+              </w:rPr>
+              <w:t>Sérieuse</w:t>
+            </w:r>
+          </w:p>
+        </w:tc>
+        <w:tc>
+          <w:tcPr>
+            <w:tcW w:w="997" w:type="dxa"/>
+            <w:tcBorders>
+              <w:top w:val="nil"/>
+              <w:left w:val="nil"/>
+              <w:bottom w:val="single" w:sz="8" w:space="0" w:color="000000"/>
+              <w:right w:val="single" w:sz="8" w:space="0" w:color="000000"/>
+            </w:tcBorders>
+            <w:shd w:val="clear" w:color="auto" w:fill="auto"/>
+            <w:hideMark/>
+          </w:tcPr>
+          <w:p>
+            <w:pPr>
+              <w:spacing w:after="0" w:line="240" w:lineRule="auto"/>
+              <w:rPr>
+                <w:rFonts w:ascii="Arial" w:eastAsia="Times New Roman" w:hAnsi="Arial" w:cs="Arial"/>
+                <w:color w:val="1F1F1F"/>
+                <w:kern w:val="0"/>
+                <w:sz w:val="22"/>
+                <w:szCs w:val="22"/>
+                <w:lang w:eastAsia="fr-CH"/>
+                <w14:ligatures w14:val="none"/>
+              </w:rPr>
+            </w:pPr>
+            <w:r>
+              <w:rPr>
+                <w:rFonts w:ascii="Arial" w:eastAsia="Times New Roman" w:hAnsi="Arial" w:cs="Arial"/>
+                <w:color w:val="1F1F1F"/>
+                <w:kern w:val="0"/>
+                <w:sz w:val="22"/>
+                <w:szCs w:val="22"/>
+                <w:lang w:eastAsia="fr-CH"/>
+                <w14:ligatures w14:val="none"/>
+              </w:rPr>
+              <w:t>Majeure</w:t>
+            </w:r>
+          </w:p>
+        </w:tc>
+        <w:tc>
+          <w:tcPr>
+            <w:tcW w:w="1046" w:type="dxa"/>
+            <w:tcBorders>
+              <w:top w:val="nil"/>
+              <w:left w:val="nil"/>
+              <w:bottom w:val="single" w:sz="8" w:space="0" w:color="000000"/>
+              <w:right w:val="single" w:sz="8" w:space="0" w:color="000000"/>
+            </w:tcBorders>
+            <w:shd w:val="clear" w:color="auto" w:fill="auto"/>
+            <w:hideMark/>
+          </w:tcPr>
+          <w:p>
+            <w:pPr>
+              <w:spacing w:after="0" w:line="240" w:lineRule="auto"/>
+              <w:rPr>
+                <w:rFonts w:ascii="Arial" w:eastAsia="Times New Roman" w:hAnsi="Arial" w:cs="Arial"/>
+                <w:color w:val="1F1F1F"/>
+                <w:kern w:val="0"/>
+                <w:sz w:val="22"/>
+                <w:szCs w:val="22"/>
+                <w:lang w:eastAsia="fr-CH"/>
+                <w14:ligatures w14:val="none"/>
+              </w:rPr>
+            </w:pPr>
+            <w:r>
+              <w:rPr>
+                <w:rFonts w:ascii="Arial" w:eastAsia="Times New Roman" w:hAnsi="Arial" w:cs="Arial"/>
+                <w:color w:val="1F1F1F"/>
+                <w:kern w:val="0"/>
+                <w:sz w:val="22"/>
+                <w:szCs w:val="22"/>
+                <w:lang w:eastAsia="fr-CH"/>
+                <w14:ligatures w14:val="none"/>
+              </w:rPr>
+              <w:t>Haute</w:t>
+            </w:r>
+          </w:p>
+        </w:tc>
+      </w:tr>
+      <w:tr>
+        <w:trPr>
+          <w:trHeight w:val="2865"/>
+        </w:trPr>
+        <w:tc>
+          <w:tcPr>
+            <w:tcW w:w="385" w:type="dxa"/>
+            <w:tcBorders>
+              <w:top w:val="nil"/>
+              <w:left w:val="single" w:sz="8" w:space="0" w:color="000000"/>
+              <w:bottom w:val="single" w:sz="8" w:space="0" w:color="000000"/>
+              <w:right w:val="single" w:sz="8" w:space="0" w:color="000000"/>
+            </w:tcBorders>
+            <w:shd w:val="clear" w:color="auto" w:fill="auto"/>
+            <w:hideMark/>
+          </w:tcPr>
+          <w:p>
+            <w:pPr>
+              <w:spacing w:after="0" w:line="240" w:lineRule="auto"/>
+              <w:rPr>
+                <w:rFonts w:ascii="Arial" w:eastAsia="Times New Roman" w:hAnsi="Arial" w:cs="Arial"/>
+                <w:b/>
+                <w:bCs/>
+                <w:color w:val="1F1F1F"/>
+                <w:kern w:val="0"/>
+                <w:sz w:val="22"/>
+                <w:szCs w:val="22"/>
+                <w:lang w:eastAsia="fr-CH"/>
+                <w14:ligatures w14:val="none"/>
+              </w:rPr>
+            </w:pPr>
+            <w:r>
+              <w:rPr>
+                <w:rFonts w:ascii="Arial" w:eastAsia="Times New Roman" w:hAnsi="Arial" w:cs="Arial"/>
+                <w:b/>
+                <w:bCs/>
+                <w:color w:val="1F1F1F"/>
+                <w:kern w:val="0"/>
+                <w:sz w:val="22"/>
+                <w:szCs w:val="22"/>
+                <w:lang w:eastAsia="fr-CH"/>
+                <w14:ligatures w14:val="none"/>
+              </w:rPr>
+              <w:t>B-03</w:t>
+            </w:r>
+          </w:p>
+        </w:tc>
+        <w:tc>
+          <w:tcPr>
+            <w:tcW w:w="1620" w:type="dxa"/>
+            <w:tcBorders>
+              <w:top w:val="nil"/>
+              <w:left w:val="nil"/>
+              <w:bottom w:val="single" w:sz="8" w:space="0" w:color="000000"/>
+              <w:right w:val="single" w:sz="8" w:space="0" w:color="000000"/>
+            </w:tcBorders>
+            <w:shd w:val="clear" w:color="auto" w:fill="auto"/>
+            <w:hideMark/>
+          </w:tcPr>
+          <w:p>
+            <w:pPr>
+              <w:spacing w:after="0" w:line="240" w:lineRule="auto"/>
+              <w:rPr>
+                <w:rFonts w:ascii="Arial" w:eastAsia="Times New Roman" w:hAnsi="Arial" w:cs="Arial"/>
+                <w:b/>
+                <w:bCs/>
+                <w:color w:val="1F1F1F"/>
+                <w:kern w:val="0"/>
+                <w:sz w:val="22"/>
+                <w:szCs w:val="22"/>
+                <w:lang w:eastAsia="fr-CH"/>
+                <w14:ligatures w14:val="none"/>
+              </w:rPr>
+            </w:pPr>
+            <w:r>
+              <w:rPr>
+                <w:rFonts w:ascii="Arial" w:eastAsia="Times New Roman" w:hAnsi="Arial" w:cs="Arial"/>
+                <w:b/>
+                <w:bCs/>
+                <w:color w:val="1F1F1F"/>
+                <w:kern w:val="0"/>
+                <w:sz w:val="22"/>
+                <w:szCs w:val="22"/>
+                <w:lang w:eastAsia="fr-CH"/>
+                <w14:ligatures w14:val="none"/>
+              </w:rPr>
+              <w:t>Validation backend permissive (Titre vide)</w:t>
+            </w:r>
+          </w:p>
+        </w:tc>
+        <w:tc>
+          <w:tcPr>
+            <w:tcW w:w="1681" w:type="dxa"/>
+            <w:tcBorders>
+              <w:top w:val="nil"/>
+              <w:left w:val="nil"/>
+              <w:bottom w:val="single" w:sz="8" w:space="0" w:color="000000"/>
+              <w:right w:val="single" w:sz="8" w:space="0" w:color="000000"/>
+            </w:tcBorders>
+            <w:shd w:val="clear" w:color="auto" w:fill="auto"/>
+            <w:hideMark/>
+          </w:tcPr>
+          <w:p>
+            <w:pPr>
+              <w:spacing w:after="0" w:line="240" w:lineRule="auto"/>
+              <w:rPr>
+                <w:rFonts w:ascii="Arial" w:eastAsia="Times New Roman" w:hAnsi="Arial" w:cs="Arial"/>
+                <w:color w:val="1F1F1F"/>
+                <w:kern w:val="0"/>
+                <w:sz w:val="22"/>
+                <w:szCs w:val="22"/>
+                <w:lang w:eastAsia="fr-CH"/>
+                <w14:ligatures w14:val="none"/>
+              </w:rPr>
+            </w:pPr>
+            <w:r>
+              <w:rPr>
+                <w:rFonts w:ascii="Arial" w:eastAsia="Times New Roman" w:hAnsi="Arial" w:cs="Arial"/>
+                <w:color w:val="1F1F1F"/>
+                <w:kern w:val="0"/>
+                <w:sz w:val="22"/>
+                <w:szCs w:val="22"/>
+                <w:lang w:eastAsia="fr-CH"/>
+                <w14:ligatures w14:val="none"/>
+              </w:rPr>
+              <w:t>1. Envoyer une requête POST/PUT avec un titre vide ou composé d'espaces.</w:t>
+            </w:r>
+          </w:p>
+        </w:tc>
+        <w:tc>
+          <w:tcPr>
+            <w:tcW w:w="1522" w:type="dxa"/>
+            <w:tcBorders>
+              <w:top w:val="nil"/>
+              <w:left w:val="nil"/>
+              <w:bottom w:val="single" w:sz="8" w:space="0" w:color="000000"/>
+              <w:right w:val="single" w:sz="8" w:space="0" w:color="000000"/>
+            </w:tcBorders>
+            <w:shd w:val="clear" w:color="auto" w:fill="auto"/>
+            <w:hideMark/>
+          </w:tcPr>
+          <w:p>
+            <w:pPr>
+              <w:spacing w:after="0" w:line="240" w:lineRule="auto"/>
+              <w:rPr>
+                <w:rFonts w:ascii="Arial" w:eastAsia="Times New Roman" w:hAnsi="Arial" w:cs="Arial"/>
+                <w:color w:val="1F1F1F"/>
+                <w:kern w:val="0"/>
+                <w:sz w:val="22"/>
+                <w:szCs w:val="22"/>
+                <w:lang w:eastAsia="fr-CH"/>
+                <w14:ligatures w14:val="none"/>
+              </w:rPr>
+            </w:pPr>
+            <w:r>
+              <w:rPr>
+                <w:rFonts w:ascii="Arial" w:eastAsia="Times New Roman" w:hAnsi="Arial" w:cs="Arial"/>
+                <w:color w:val="1F1F1F"/>
+                <w:kern w:val="0"/>
+                <w:sz w:val="22"/>
+                <w:szCs w:val="22"/>
+                <w:lang w:eastAsia="fr-CH"/>
+                <w14:ligatures w14:val="none"/>
+              </w:rPr>
+              <w:t>Le backend doit retourner une erreur de validation 422.</w:t>
+            </w:r>
+          </w:p>
+        </w:tc>
+        <w:tc>
+          <w:tcPr>
+            <w:tcW w:w="1351" w:type="dxa"/>
+            <w:tcBorders>
+              <w:top w:val="nil"/>
+              <w:left w:val="nil"/>
+              <w:bottom w:val="single" w:sz="8" w:space="0" w:color="000000"/>
+              <w:right w:val="single" w:sz="8" w:space="0" w:color="000000"/>
+            </w:tcBorders>
+            <w:shd w:val="clear" w:color="auto" w:fill="auto"/>
+            <w:hideMark/>
+          </w:tcPr>
+          <w:p>
+            <w:pPr>
+              <w:spacing w:after="0" w:line="240" w:lineRule="auto"/>
+              <w:rPr>
+                <w:rFonts w:ascii="Arial" w:eastAsia="Times New Roman" w:hAnsi="Arial" w:cs="Arial"/>
+                <w:color w:val="1F1F1F"/>
+                <w:kern w:val="0"/>
+                <w:sz w:val="22"/>
+                <w:szCs w:val="22"/>
+                <w:lang w:eastAsia="fr-CH"/>
+                <w14:ligatures w14:val="none"/>
+              </w:rPr>
+            </w:pPr>
+            <w:r>
+              <w:rPr>
+                <w:rFonts w:ascii="Arial" w:eastAsia="Times New Roman" w:hAnsi="Arial" w:cs="Arial"/>
+                <w:color w:val="1F1F1F"/>
+                <w:kern w:val="0"/>
+                <w:sz w:val="22"/>
+                <w:szCs w:val="22"/>
+                <w:lang w:eastAsia="fr-CH"/>
+                <w14:ligatures w14:val="none"/>
+              </w:rPr>
+              <w:t>Le backend accepte la tâche car la longueur minimale est fixée à 0 dans le validateur.</w:t>
+            </w:r>
+          </w:p>
+        </w:tc>
+        <w:tc>
+          <w:tcPr>
+            <w:tcW w:w="1314" w:type="dxa"/>
+            <w:tcBorders>
+              <w:top w:val="nil"/>
+              <w:left w:val="nil"/>
+              <w:bottom w:val="single" w:sz="8" w:space="0" w:color="000000"/>
+              <w:right w:val="single" w:sz="8" w:space="0" w:color="000000"/>
+            </w:tcBorders>
+            <w:shd w:val="clear" w:color="auto" w:fill="auto"/>
+            <w:hideMark/>
+          </w:tcPr>
+          <w:p>
+            <w:pPr>
+              <w:spacing w:after="0" w:line="240" w:lineRule="auto"/>
+              <w:rPr>
+                <w:rFonts w:ascii="Arial" w:eastAsia="Times New Roman" w:hAnsi="Arial" w:cs="Arial"/>
+                <w:color w:val="1F1F1F"/>
+                <w:kern w:val="0"/>
+                <w:sz w:val="22"/>
+                <w:szCs w:val="22"/>
+                <w:lang w:eastAsia="fr-CH"/>
+                <w14:ligatures w14:val="none"/>
+              </w:rPr>
+            </w:pPr>
+            <w:r>
+              <w:rPr>
+                <w:rFonts w:ascii="Arial" w:eastAsia="Times New Roman" w:hAnsi="Arial" w:cs="Arial"/>
+                <w:color w:val="1F1F1F"/>
+                <w:kern w:val="0"/>
+                <w:sz w:val="22"/>
+                <w:szCs w:val="22"/>
+                <w:lang w:eastAsia="fr-CH"/>
+                <w14:ligatures w14:val="none"/>
+              </w:rPr>
+              <w:t>Sérieuse</w:t>
+            </w:r>
+          </w:p>
+        </w:tc>
+        <w:tc>
+          <w:tcPr>
+            <w:tcW w:w="997" w:type="dxa"/>
+            <w:tcBorders>
+              <w:top w:val="nil"/>
+              <w:left w:val="nil"/>
+              <w:bottom w:val="single" w:sz="8" w:space="0" w:color="000000"/>
+              <w:right w:val="single" w:sz="8" w:space="0" w:color="000000"/>
+            </w:tcBorders>
+            <w:shd w:val="clear" w:color="auto" w:fill="auto"/>
+            <w:hideMark/>
+          </w:tcPr>
+          <w:p>
+            <w:pPr>
+              <w:spacing w:after="0" w:line="240" w:lineRule="auto"/>
+              <w:rPr>
+                <w:rFonts w:ascii="Arial" w:eastAsia="Times New Roman" w:hAnsi="Arial" w:cs="Arial"/>
+                <w:color w:val="1F1F1F"/>
+                <w:kern w:val="0"/>
+                <w:sz w:val="22"/>
+                <w:szCs w:val="22"/>
+                <w:lang w:eastAsia="fr-CH"/>
+                <w14:ligatures w14:val="none"/>
+              </w:rPr>
+            </w:pPr>
+            <w:r>
+              <w:rPr>
+                <w:rFonts w:ascii="Arial" w:eastAsia="Times New Roman" w:hAnsi="Arial" w:cs="Arial"/>
+                <w:color w:val="1F1F1F"/>
+                <w:kern w:val="0"/>
+                <w:sz w:val="22"/>
+                <w:szCs w:val="22"/>
+                <w:lang w:eastAsia="fr-CH"/>
+                <w14:ligatures w14:val="none"/>
+              </w:rPr>
+              <w:t>Majeure</w:t>
+            </w:r>
+          </w:p>
+        </w:tc>
+        <w:tc>
+          <w:tcPr>
+            <w:tcW w:w="1046" w:type="dxa"/>
+            <w:tcBorders>
+              <w:top w:val="nil"/>
+              <w:left w:val="nil"/>
+              <w:bottom w:val="single" w:sz="8" w:space="0" w:color="000000"/>
+              <w:right w:val="single" w:sz="8" w:space="0" w:color="000000"/>
+            </w:tcBorders>
+            <w:shd w:val="clear" w:color="auto" w:fill="auto"/>
+            <w:hideMark/>
+          </w:tcPr>
+          <w:p>
+            <w:pPr>
+              <w:spacing w:after="0" w:line="240" w:lineRule="auto"/>
+              <w:rPr>
+                <w:rFonts w:ascii="Arial" w:eastAsia="Times New Roman" w:hAnsi="Arial" w:cs="Arial"/>
+                <w:color w:val="1F1F1F"/>
+                <w:kern w:val="0"/>
+                <w:sz w:val="22"/>
+                <w:szCs w:val="22"/>
+                <w:lang w:eastAsia="fr-CH"/>
+                <w14:ligatures w14:val="none"/>
+              </w:rPr>
+            </w:pPr>
+            <w:r>
+              <w:rPr>
+                <w:rFonts w:ascii="Arial" w:eastAsia="Times New Roman" w:hAnsi="Arial" w:cs="Arial"/>
+                <w:color w:val="1F1F1F"/>
+                <w:kern w:val="0"/>
+                <w:sz w:val="22"/>
+                <w:szCs w:val="22"/>
+                <w:lang w:eastAsia="fr-CH"/>
+                <w14:ligatures w14:val="none"/>
+              </w:rPr>
+              <w:t>Haute</w:t>
+            </w:r>
+          </w:p>
+        </w:tc>
+      </w:tr>
+      <w:tr>
+        <w:trPr>
+          <w:trHeight w:val="3435"/>
+        </w:trPr>
+        <w:tc>
+          <w:tcPr>
+            <w:tcW w:w="385" w:type="dxa"/>
+            <w:tcBorders>
+              <w:top w:val="nil"/>
+              <w:left w:val="single" w:sz="8" w:space="0" w:color="000000"/>
+              <w:bottom w:val="single" w:sz="8" w:space="0" w:color="000000"/>
+              <w:right w:val="single" w:sz="8" w:space="0" w:color="000000"/>
+            </w:tcBorders>
+            <w:shd w:val="clear" w:color="auto" w:fill="auto"/>
+            <w:hideMark/>
+          </w:tcPr>
+          <w:p>
+            <w:pPr>
+              <w:spacing w:after="0" w:line="240" w:lineRule="auto"/>
+              <w:rPr>
+                <w:rFonts w:ascii="Arial" w:eastAsia="Times New Roman" w:hAnsi="Arial" w:cs="Arial"/>
+                <w:b/>
+                <w:bCs/>
+                <w:color w:val="1F1F1F"/>
+                <w:kern w:val="0"/>
+                <w:sz w:val="22"/>
+                <w:szCs w:val="22"/>
+                <w:lang w:eastAsia="fr-CH"/>
+                <w14:ligatures w14:val="none"/>
+              </w:rPr>
+            </w:pPr>
+            <w:r>
+              <w:rPr>
+                <w:rFonts w:ascii="Arial" w:eastAsia="Times New Roman" w:hAnsi="Arial" w:cs="Arial"/>
+                <w:b/>
+                <w:bCs/>
+                <w:color w:val="1F1F1F"/>
+                <w:kern w:val="0"/>
+                <w:sz w:val="22"/>
+                <w:szCs w:val="22"/>
+                <w:lang w:eastAsia="fr-CH"/>
+                <w14:ligatures w14:val="none"/>
+              </w:rPr>
+              <w:lastRenderedPageBreak/>
+              <w:t>B-04</w:t>
+            </w:r>
+          </w:p>
+        </w:tc>
+        <w:tc>
+          <w:tcPr>
+            <w:tcW w:w="1620" w:type="dxa"/>
+            <w:tcBorders>
+              <w:top w:val="nil"/>
+              <w:left w:val="nil"/>
+              <w:bottom w:val="single" w:sz="8" w:space="0" w:color="000000"/>
+              <w:right w:val="single" w:sz="8" w:space="0" w:color="000000"/>
+            </w:tcBorders>
+            <w:shd w:val="clear" w:color="auto" w:fill="auto"/>
+            <w:hideMark/>
+          </w:tcPr>
+          <w:p>
+            <w:pPr>
+              <w:spacing w:after="0" w:line="240" w:lineRule="auto"/>
+              <w:rPr>
+                <w:rFonts w:ascii="Arial" w:eastAsia="Times New Roman" w:hAnsi="Arial" w:cs="Arial"/>
+                <w:b/>
+                <w:bCs/>
+                <w:color w:val="1F1F1F"/>
+                <w:kern w:val="0"/>
+                <w:sz w:val="22"/>
+                <w:szCs w:val="22"/>
+                <w:lang w:eastAsia="fr-CH"/>
+                <w14:ligatures w14:val="none"/>
+              </w:rPr>
+            </w:pPr>
+            <w:r>
+              <w:rPr>
+                <w:rFonts w:ascii="Arial" w:eastAsia="Times New Roman" w:hAnsi="Arial" w:cs="Arial"/>
+                <w:b/>
+                <w:bCs/>
+                <w:color w:val="1F1F1F"/>
+                <w:kern w:val="0"/>
+                <w:sz w:val="22"/>
+                <w:szCs w:val="22"/>
+                <w:lang w:eastAsia="fr-CH"/>
+                <w14:ligatures w14:val="none"/>
+              </w:rPr>
+              <w:t>Incohérence de tri (Commentaire vs Code)</w:t>
+            </w:r>
+          </w:p>
+        </w:tc>
+        <w:tc>
+          <w:tcPr>
+            <w:tcW w:w="1681" w:type="dxa"/>
+            <w:tcBorders>
+              <w:top w:val="nil"/>
+              <w:left w:val="nil"/>
+              <w:bottom w:val="single" w:sz="8" w:space="0" w:color="000000"/>
+              <w:right w:val="single" w:sz="8" w:space="0" w:color="000000"/>
+            </w:tcBorders>
+            <w:shd w:val="clear" w:color="auto" w:fill="auto"/>
+            <w:hideMark/>
+          </w:tcPr>
+          <w:p>
+            <w:pPr>
+              <w:spacing w:after="0" w:line="240" w:lineRule="auto"/>
+              <w:rPr>
+                <w:rFonts w:ascii="Arial" w:eastAsia="Times New Roman" w:hAnsi="Arial" w:cs="Arial"/>
+                <w:color w:val="1F1F1F"/>
+                <w:kern w:val="0"/>
+                <w:sz w:val="22"/>
+                <w:szCs w:val="22"/>
+                <w:lang w:eastAsia="fr-CH"/>
+                <w14:ligatures w14:val="none"/>
+              </w:rPr>
+            </w:pPr>
+            <w:r>
+              <w:rPr>
+                <w:rFonts w:ascii="Arial" w:eastAsia="Times New Roman" w:hAnsi="Arial" w:cs="Arial"/>
+                <w:color w:val="1F1F1F"/>
+                <w:kern w:val="0"/>
+                <w:sz w:val="22"/>
+                <w:szCs w:val="22"/>
+                <w:lang w:eastAsia="fr-CH"/>
+                <w14:ligatures w14:val="none"/>
+              </w:rPr>
+              <w:t>1. Créer plusieurs tâches avec des dates de création et d'échéance différentes. 2. Recharger la liste.</w:t>
+            </w:r>
+          </w:p>
+        </w:tc>
+        <w:tc>
+          <w:tcPr>
+            <w:tcW w:w="1522" w:type="dxa"/>
+            <w:tcBorders>
+              <w:top w:val="nil"/>
+              <w:left w:val="nil"/>
+              <w:bottom w:val="single" w:sz="8" w:space="0" w:color="000000"/>
+              <w:right w:val="single" w:sz="8" w:space="0" w:color="000000"/>
+            </w:tcBorders>
+            <w:shd w:val="clear" w:color="auto" w:fill="auto"/>
+            <w:hideMark/>
+          </w:tcPr>
+          <w:p>
+            <w:pPr>
+              <w:spacing w:after="0" w:line="240" w:lineRule="auto"/>
+              <w:rPr>
+                <w:rFonts w:ascii="Arial" w:eastAsia="Times New Roman" w:hAnsi="Arial" w:cs="Arial"/>
+                <w:color w:val="1F1F1F"/>
+                <w:kern w:val="0"/>
+                <w:sz w:val="22"/>
+                <w:szCs w:val="22"/>
+                <w:lang w:eastAsia="fr-CH"/>
+                <w14:ligatures w14:val="none"/>
+              </w:rPr>
+            </w:pPr>
+            <w:r>
+              <w:rPr>
+                <w:rFonts w:ascii="Arial" w:eastAsia="Times New Roman" w:hAnsi="Arial" w:cs="Arial"/>
+                <w:color w:val="1F1F1F"/>
+                <w:kern w:val="0"/>
+                <w:sz w:val="22"/>
+                <w:szCs w:val="22"/>
+                <w:lang w:eastAsia="fr-CH"/>
+                <w14:ligatures w14:val="none"/>
+              </w:rPr>
+              <w:t>Tri par "deadline" comme spécifié dans les commentaires du code.</w:t>
+            </w:r>
+          </w:p>
+        </w:tc>
+        <w:tc>
+          <w:tcPr>
+            <w:tcW w:w="1351" w:type="dxa"/>
+            <w:tcBorders>
+              <w:top w:val="nil"/>
+              <w:left w:val="nil"/>
+              <w:bottom w:val="single" w:sz="8" w:space="0" w:color="000000"/>
+              <w:right w:val="single" w:sz="8" w:space="0" w:color="000000"/>
+            </w:tcBorders>
+            <w:shd w:val="clear" w:color="auto" w:fill="auto"/>
+            <w:hideMark/>
+          </w:tcPr>
+          <w:p>
+            <w:pPr>
+              <w:spacing w:after="0" w:line="240" w:lineRule="auto"/>
+              <w:rPr>
+                <w:rFonts w:ascii="Arial" w:eastAsia="Times New Roman" w:hAnsi="Arial" w:cs="Arial"/>
+                <w:color w:val="1F1F1F"/>
+                <w:kern w:val="0"/>
+                <w:sz w:val="22"/>
+                <w:szCs w:val="22"/>
+                <w:lang w:eastAsia="fr-CH"/>
+                <w14:ligatures w14:val="none"/>
+              </w:rPr>
+            </w:pPr>
+            <w:r>
+              <w:rPr>
+                <w:rFonts w:ascii="Arial" w:eastAsia="Times New Roman" w:hAnsi="Arial" w:cs="Arial"/>
+                <w:color w:val="1F1F1F"/>
+                <w:kern w:val="0"/>
+                <w:sz w:val="22"/>
+                <w:szCs w:val="22"/>
+                <w:lang w:eastAsia="fr-CH"/>
+                <w14:ligatures w14:val="none"/>
+              </w:rPr>
+              <w:t>Les tâches sont triées par date de création (</w:t>
+            </w:r>
+            <w:proofErr w:type="spellStart"/>
+            <w:r>
+              <w:rPr>
+                <w:rFonts w:ascii="Arial" w:eastAsia="Times New Roman" w:hAnsi="Arial" w:cs="Arial"/>
+                <w:color w:val="444746"/>
+                <w:kern w:val="0"/>
+                <w:sz w:val="20"/>
+                <w:szCs w:val="20"/>
+                <w:lang w:eastAsia="fr-CH"/>
+                <w14:ligatures w14:val="none"/>
+              </w:rPr>
+              <w:t>created_at</w:t>
+            </w:r>
+            <w:proofErr w:type="spellEnd"/>
+            <w:r>
+              <w:rPr>
+                <w:rFonts w:ascii="Arial" w:eastAsia="Times New Roman" w:hAnsi="Arial" w:cs="Arial"/>
+                <w:color w:val="1F1F1F"/>
+                <w:kern w:val="0"/>
+                <w:sz w:val="22"/>
+                <w:szCs w:val="22"/>
+                <w:lang w:eastAsia="fr-CH"/>
+                <w14:ligatures w14:val="none"/>
+              </w:rPr>
+              <w:t>) uniquement.</w:t>
+            </w:r>
+          </w:p>
+        </w:tc>
+        <w:tc>
+          <w:tcPr>
+            <w:tcW w:w="1314" w:type="dxa"/>
+            <w:tcBorders>
+              <w:top w:val="nil"/>
+              <w:left w:val="nil"/>
+              <w:bottom w:val="single" w:sz="8" w:space="0" w:color="000000"/>
+              <w:right w:val="single" w:sz="8" w:space="0" w:color="000000"/>
+            </w:tcBorders>
+            <w:shd w:val="clear" w:color="auto" w:fill="auto"/>
+            <w:hideMark/>
+          </w:tcPr>
+          <w:p>
+            <w:pPr>
+              <w:spacing w:after="0" w:line="240" w:lineRule="auto"/>
+              <w:rPr>
+                <w:rFonts w:ascii="Arial" w:eastAsia="Times New Roman" w:hAnsi="Arial" w:cs="Arial"/>
+                <w:color w:val="1F1F1F"/>
+                <w:kern w:val="0"/>
+                <w:sz w:val="22"/>
+                <w:szCs w:val="22"/>
+                <w:lang w:eastAsia="fr-CH"/>
+                <w14:ligatures w14:val="none"/>
+              </w:rPr>
+            </w:pPr>
+            <w:r>
+              <w:rPr>
+                <w:rFonts w:ascii="Arial" w:eastAsia="Times New Roman" w:hAnsi="Arial" w:cs="Arial"/>
+                <w:color w:val="1F1F1F"/>
+                <w:kern w:val="0"/>
+                <w:sz w:val="22"/>
+                <w:szCs w:val="22"/>
+                <w:lang w:eastAsia="fr-CH"/>
+                <w14:ligatures w14:val="none"/>
+              </w:rPr>
+              <w:t>Mineure</w:t>
+            </w:r>
+          </w:p>
+        </w:tc>
+        <w:tc>
+          <w:tcPr>
+            <w:tcW w:w="997" w:type="dxa"/>
+            <w:tcBorders>
+              <w:top w:val="nil"/>
+              <w:left w:val="nil"/>
+              <w:bottom w:val="single" w:sz="8" w:space="0" w:color="000000"/>
+              <w:right w:val="single" w:sz="8" w:space="0" w:color="000000"/>
+            </w:tcBorders>
+            <w:shd w:val="clear" w:color="auto" w:fill="auto"/>
+            <w:hideMark/>
+          </w:tcPr>
+          <w:p>
+            <w:pPr>
+              <w:spacing w:after="0" w:line="240" w:lineRule="auto"/>
+              <w:rPr>
+                <w:rFonts w:ascii="Arial" w:eastAsia="Times New Roman" w:hAnsi="Arial" w:cs="Arial"/>
+                <w:color w:val="1F1F1F"/>
+                <w:kern w:val="0"/>
+                <w:sz w:val="22"/>
+                <w:szCs w:val="22"/>
+                <w:lang w:eastAsia="fr-CH"/>
+                <w14:ligatures w14:val="none"/>
+              </w:rPr>
+            </w:pPr>
+            <w:r>
+              <w:rPr>
+                <w:rFonts w:ascii="Arial" w:eastAsia="Times New Roman" w:hAnsi="Arial" w:cs="Arial"/>
+                <w:color w:val="1F1F1F"/>
+                <w:kern w:val="0"/>
+                <w:sz w:val="22"/>
+                <w:szCs w:val="22"/>
+                <w:lang w:eastAsia="fr-CH"/>
+                <w14:ligatures w14:val="none"/>
+              </w:rPr>
+              <w:t>Mineure</w:t>
+            </w:r>
+          </w:p>
+        </w:tc>
+        <w:tc>
+          <w:tcPr>
+            <w:tcW w:w="1046" w:type="dxa"/>
+            <w:tcBorders>
+              <w:top w:val="nil"/>
+              <w:left w:val="nil"/>
+              <w:bottom w:val="single" w:sz="8" w:space="0" w:color="000000"/>
+              <w:right w:val="single" w:sz="8" w:space="0" w:color="000000"/>
+            </w:tcBorders>
+            <w:shd w:val="clear" w:color="auto" w:fill="auto"/>
+            <w:hideMark/>
+          </w:tcPr>
+          <w:p>
+            <w:pPr>
+              <w:spacing w:after="0" w:line="240" w:lineRule="auto"/>
+              <w:rPr>
+                <w:rFonts w:ascii="Arial" w:eastAsia="Times New Roman" w:hAnsi="Arial" w:cs="Arial"/>
+                <w:color w:val="1F1F1F"/>
+                <w:kern w:val="0"/>
+                <w:sz w:val="22"/>
+                <w:szCs w:val="22"/>
+                <w:lang w:eastAsia="fr-CH"/>
+                <w14:ligatures w14:val="none"/>
+              </w:rPr>
+            </w:pPr>
+            <w:r>
+              <w:rPr>
+                <w:rFonts w:ascii="Arial" w:eastAsia="Times New Roman" w:hAnsi="Arial" w:cs="Arial"/>
+                <w:color w:val="1F1F1F"/>
+                <w:kern w:val="0"/>
+                <w:sz w:val="22"/>
+                <w:szCs w:val="22"/>
+                <w:lang w:eastAsia="fr-CH"/>
+                <w14:ligatures w14:val="none"/>
+              </w:rPr>
+              <w:t>Basse</w:t>
+            </w:r>
+          </w:p>
+        </w:tc>
+      </w:tr>
+      <w:tr>
+        <w:trPr>
+          <w:trHeight w:val="2265"/>
+        </w:trPr>
+        <w:tc>
+          <w:tcPr>
+            <w:tcW w:w="385" w:type="dxa"/>
+            <w:tcBorders>
+              <w:top w:val="nil"/>
+              <w:left w:val="single" w:sz="8" w:space="0" w:color="000000"/>
+              <w:bottom w:val="single" w:sz="8" w:space="0" w:color="000000"/>
+              <w:right w:val="single" w:sz="8" w:space="0" w:color="000000"/>
+            </w:tcBorders>
+            <w:shd w:val="clear" w:color="auto" w:fill="auto"/>
+            <w:hideMark/>
+          </w:tcPr>
+          <w:p>
+            <w:pPr>
+              <w:spacing w:after="0" w:line="240" w:lineRule="auto"/>
+              <w:rPr>
+                <w:rFonts w:ascii="Arial" w:eastAsia="Times New Roman" w:hAnsi="Arial" w:cs="Arial"/>
+                <w:b/>
+                <w:bCs/>
+                <w:color w:val="1F1F1F"/>
+                <w:kern w:val="0"/>
+                <w:sz w:val="22"/>
+                <w:szCs w:val="22"/>
+                <w:lang w:eastAsia="fr-CH"/>
+                <w14:ligatures w14:val="none"/>
+              </w:rPr>
+            </w:pPr>
+            <w:r>
+              <w:rPr>
+                <w:rFonts w:ascii="Arial" w:eastAsia="Times New Roman" w:hAnsi="Arial" w:cs="Arial"/>
+                <w:b/>
+                <w:bCs/>
+                <w:color w:val="1F1F1F"/>
+                <w:kern w:val="0"/>
+                <w:sz w:val="22"/>
+                <w:szCs w:val="22"/>
+                <w:lang w:eastAsia="fr-CH"/>
+                <w14:ligatures w14:val="none"/>
+              </w:rPr>
+              <w:t>B-05</w:t>
+            </w:r>
+          </w:p>
+        </w:tc>
+        <w:tc>
+          <w:tcPr>
+            <w:tcW w:w="1620" w:type="dxa"/>
+            <w:tcBorders>
+              <w:top w:val="nil"/>
+              <w:left w:val="nil"/>
+              <w:bottom w:val="single" w:sz="8" w:space="0" w:color="000000"/>
+              <w:right w:val="single" w:sz="8" w:space="0" w:color="000000"/>
+            </w:tcBorders>
+            <w:shd w:val="clear" w:color="auto" w:fill="auto"/>
+            <w:hideMark/>
+          </w:tcPr>
+          <w:p>
+            <w:pPr>
+              <w:spacing w:after="0" w:line="240" w:lineRule="auto"/>
+              <w:rPr>
+                <w:rFonts w:ascii="Arial" w:eastAsia="Times New Roman" w:hAnsi="Arial" w:cs="Arial"/>
+                <w:b/>
+                <w:bCs/>
+                <w:color w:val="1F1F1F"/>
+                <w:kern w:val="0"/>
+                <w:sz w:val="22"/>
+                <w:szCs w:val="22"/>
+                <w:lang w:eastAsia="fr-CH"/>
+                <w14:ligatures w14:val="none"/>
+              </w:rPr>
+            </w:pPr>
+            <w:r>
+              <w:rPr>
+                <w:rFonts w:ascii="Arial" w:eastAsia="Times New Roman" w:hAnsi="Arial" w:cs="Arial"/>
+                <w:b/>
+                <w:bCs/>
+                <w:color w:val="1F1F1F"/>
+                <w:kern w:val="0"/>
+                <w:sz w:val="22"/>
+                <w:szCs w:val="22"/>
+                <w:lang w:eastAsia="fr-CH"/>
+                <w14:ligatures w14:val="none"/>
+              </w:rPr>
+              <w:t>Réponse API incohérente (Show)</w:t>
+            </w:r>
+          </w:p>
+        </w:tc>
+        <w:tc>
+          <w:tcPr>
+            <w:tcW w:w="1681" w:type="dxa"/>
+            <w:tcBorders>
+              <w:top w:val="nil"/>
+              <w:left w:val="nil"/>
+              <w:bottom w:val="single" w:sz="8" w:space="0" w:color="000000"/>
+              <w:right w:val="single" w:sz="8" w:space="0" w:color="000000"/>
+            </w:tcBorders>
+            <w:shd w:val="clear" w:color="auto" w:fill="auto"/>
+            <w:hideMark/>
+          </w:tcPr>
+          <w:p>
+            <w:pPr>
+              <w:spacing w:after="0" w:line="240" w:lineRule="auto"/>
+              <w:rPr>
+                <w:rFonts w:ascii="Arial" w:eastAsia="Times New Roman" w:hAnsi="Arial" w:cs="Arial"/>
+                <w:color w:val="1F1F1F"/>
+                <w:kern w:val="0"/>
+                <w:sz w:val="22"/>
+                <w:szCs w:val="22"/>
+                <w:lang w:eastAsia="fr-CH"/>
+                <w14:ligatures w14:val="none"/>
+              </w:rPr>
+            </w:pPr>
+            <w:r>
+              <w:rPr>
+                <w:rFonts w:ascii="Arial" w:eastAsia="Times New Roman" w:hAnsi="Arial" w:cs="Arial"/>
+                <w:color w:val="1F1F1F"/>
+                <w:kern w:val="0"/>
+                <w:sz w:val="22"/>
+                <w:szCs w:val="22"/>
+                <w:lang w:eastAsia="fr-CH"/>
+                <w14:ligatures w14:val="none"/>
+              </w:rPr>
+              <w:t xml:space="preserve">1. Appeler l'API </w:t>
+            </w:r>
+            <w:r>
+              <w:rPr>
+                <w:rFonts w:ascii="Arial" w:eastAsia="Times New Roman" w:hAnsi="Arial" w:cs="Arial"/>
+                <w:color w:val="444746"/>
+                <w:kern w:val="0"/>
+                <w:sz w:val="20"/>
+                <w:szCs w:val="20"/>
+                <w:lang w:eastAsia="fr-CH"/>
+                <w14:ligatures w14:val="none"/>
+              </w:rPr>
+              <w:t>GET /api/</w:t>
+            </w:r>
+            <w:proofErr w:type="spellStart"/>
+            <w:r>
+              <w:rPr>
+                <w:rFonts w:ascii="Arial" w:eastAsia="Times New Roman" w:hAnsi="Arial" w:cs="Arial"/>
+                <w:color w:val="444746"/>
+                <w:kern w:val="0"/>
+                <w:sz w:val="20"/>
+                <w:szCs w:val="20"/>
+                <w:lang w:eastAsia="fr-CH"/>
+                <w14:ligatures w14:val="none"/>
+              </w:rPr>
+              <w:t>tasks</w:t>
+            </w:r>
+            <w:proofErr w:type="spellEnd"/>
+            <w:proofErr w:type="gramStart"/>
+            <w:r>
+              <w:rPr>
+                <w:rFonts w:ascii="Arial" w:eastAsia="Times New Roman" w:hAnsi="Arial" w:cs="Arial"/>
+                <w:color w:val="444746"/>
+                <w:kern w:val="0"/>
+                <w:sz w:val="20"/>
+                <w:szCs w:val="20"/>
+                <w:lang w:eastAsia="fr-CH"/>
+                <w14:ligatures w14:val="none"/>
+              </w:rPr>
+              <w:t>/:</w:t>
+            </w:r>
+            <w:proofErr w:type="gramEnd"/>
+            <w:r>
+              <w:rPr>
+                <w:rFonts w:ascii="Arial" w:eastAsia="Times New Roman" w:hAnsi="Arial" w:cs="Arial"/>
+                <w:color w:val="444746"/>
+                <w:kern w:val="0"/>
+                <w:sz w:val="20"/>
+                <w:szCs w:val="20"/>
+                <w:lang w:eastAsia="fr-CH"/>
+                <w14:ligatures w14:val="none"/>
+              </w:rPr>
+              <w:t>id</w:t>
+            </w:r>
+            <w:r>
+              <w:rPr>
+                <w:rFonts w:ascii="Arial" w:eastAsia="Times New Roman" w:hAnsi="Arial" w:cs="Arial"/>
+                <w:color w:val="1F1F1F"/>
+                <w:kern w:val="0"/>
+                <w:sz w:val="22"/>
+                <w:szCs w:val="22"/>
+                <w:lang w:eastAsia="fr-CH"/>
+                <w14:ligatures w14:val="none"/>
+              </w:rPr>
+              <w:t xml:space="preserve"> via un outil de test (Postman/</w:t>
+            </w:r>
+            <w:proofErr w:type="spellStart"/>
+            <w:r>
+              <w:rPr>
+                <w:rFonts w:ascii="Arial" w:eastAsia="Times New Roman" w:hAnsi="Arial" w:cs="Arial"/>
+                <w:color w:val="1F1F1F"/>
+                <w:kern w:val="0"/>
+                <w:sz w:val="22"/>
+                <w:szCs w:val="22"/>
+                <w:lang w:eastAsia="fr-CH"/>
+                <w14:ligatures w14:val="none"/>
+              </w:rPr>
+              <w:t>Curl</w:t>
+            </w:r>
+            <w:proofErr w:type="spellEnd"/>
+            <w:r>
+              <w:rPr>
+                <w:rFonts w:ascii="Arial" w:eastAsia="Times New Roman" w:hAnsi="Arial" w:cs="Arial"/>
+                <w:color w:val="1F1F1F"/>
+                <w:kern w:val="0"/>
+                <w:sz w:val="22"/>
+                <w:szCs w:val="22"/>
+                <w:lang w:eastAsia="fr-CH"/>
+                <w14:ligatures w14:val="none"/>
+              </w:rPr>
+              <w:t>).</w:t>
+            </w:r>
+          </w:p>
+        </w:tc>
+        <w:tc>
+          <w:tcPr>
+            <w:tcW w:w="1522" w:type="dxa"/>
+            <w:tcBorders>
+              <w:top w:val="nil"/>
+              <w:left w:val="nil"/>
+              <w:bottom w:val="single" w:sz="8" w:space="0" w:color="000000"/>
+              <w:right w:val="single" w:sz="8" w:space="0" w:color="000000"/>
+            </w:tcBorders>
+            <w:shd w:val="clear" w:color="auto" w:fill="auto"/>
+            <w:hideMark/>
+          </w:tcPr>
+          <w:p>
+            <w:pPr>
+              <w:spacing w:after="0" w:line="240" w:lineRule="auto"/>
+              <w:rPr>
+                <w:rFonts w:ascii="Arial" w:eastAsia="Times New Roman" w:hAnsi="Arial" w:cs="Arial"/>
+                <w:color w:val="1F1F1F"/>
+                <w:kern w:val="0"/>
+                <w:sz w:val="22"/>
+                <w:szCs w:val="22"/>
+                <w:lang w:eastAsia="fr-CH"/>
+                <w14:ligatures w14:val="none"/>
+              </w:rPr>
+            </w:pPr>
+            <w:r>
+              <w:rPr>
+                <w:rFonts w:ascii="Arial" w:eastAsia="Times New Roman" w:hAnsi="Arial" w:cs="Arial"/>
+                <w:color w:val="1F1F1F"/>
+                <w:kern w:val="0"/>
+                <w:sz w:val="22"/>
+                <w:szCs w:val="22"/>
+                <w:lang w:eastAsia="fr-CH"/>
+                <w14:ligatures w14:val="none"/>
+              </w:rPr>
+              <w:t>Recevoir un objet JSON unique.</w:t>
+            </w:r>
+          </w:p>
+        </w:tc>
+        <w:tc>
+          <w:tcPr>
+            <w:tcW w:w="1351" w:type="dxa"/>
+            <w:tcBorders>
+              <w:top w:val="nil"/>
+              <w:left w:val="nil"/>
+              <w:bottom w:val="single" w:sz="8" w:space="0" w:color="000000"/>
+              <w:right w:val="single" w:sz="8" w:space="0" w:color="000000"/>
+            </w:tcBorders>
+            <w:shd w:val="clear" w:color="auto" w:fill="auto"/>
+            <w:hideMark/>
+          </w:tcPr>
+          <w:p>
+            <w:pPr>
+              <w:spacing w:after="0" w:line="240" w:lineRule="auto"/>
+              <w:rPr>
+                <w:rFonts w:ascii="Arial" w:eastAsia="Times New Roman" w:hAnsi="Arial" w:cs="Arial"/>
+                <w:color w:val="1F1F1F"/>
+                <w:kern w:val="0"/>
+                <w:sz w:val="22"/>
+                <w:szCs w:val="22"/>
+                <w:lang w:eastAsia="fr-CH"/>
+                <w14:ligatures w14:val="none"/>
+              </w:rPr>
+            </w:pPr>
+            <w:r>
+              <w:rPr>
+                <w:rFonts w:ascii="Arial" w:eastAsia="Times New Roman" w:hAnsi="Arial" w:cs="Arial"/>
+                <w:color w:val="1F1F1F"/>
+                <w:kern w:val="0"/>
+                <w:sz w:val="22"/>
+                <w:szCs w:val="22"/>
+                <w:lang w:eastAsia="fr-CH"/>
+                <w14:ligatures w14:val="none"/>
+              </w:rPr>
+              <w:t xml:space="preserve">L'API retourne un tableau contenant l'objet </w:t>
+            </w:r>
+            <w:r>
+              <w:rPr>
+                <w:rFonts w:ascii="Arial" w:eastAsia="Times New Roman" w:hAnsi="Arial" w:cs="Arial"/>
+                <w:color w:val="444746"/>
+                <w:kern w:val="0"/>
+                <w:sz w:val="20"/>
+                <w:szCs w:val="20"/>
+                <w:lang w:eastAsia="fr-CH"/>
+                <w14:ligatures w14:val="none"/>
+              </w:rPr>
+              <w:t>[{...}]</w:t>
+            </w:r>
+            <w:r>
+              <w:rPr>
+                <w:rFonts w:ascii="Arial" w:eastAsia="Times New Roman" w:hAnsi="Arial" w:cs="Arial"/>
+                <w:color w:val="1F1F1F"/>
+                <w:kern w:val="0"/>
+                <w:sz w:val="22"/>
+                <w:szCs w:val="22"/>
+                <w:lang w:eastAsia="fr-CH"/>
+                <w14:ligatures w14:val="none"/>
+              </w:rPr>
+              <w:t xml:space="preserve"> au lieu de l'objet seul.</w:t>
+            </w:r>
+          </w:p>
+        </w:tc>
+        <w:tc>
+          <w:tcPr>
+            <w:tcW w:w="1314" w:type="dxa"/>
+            <w:tcBorders>
+              <w:top w:val="nil"/>
+              <w:left w:val="nil"/>
+              <w:bottom w:val="single" w:sz="8" w:space="0" w:color="000000"/>
+              <w:right w:val="single" w:sz="8" w:space="0" w:color="000000"/>
+            </w:tcBorders>
+            <w:shd w:val="clear" w:color="auto" w:fill="auto"/>
+            <w:hideMark/>
+          </w:tcPr>
+          <w:p>
+            <w:pPr>
+              <w:spacing w:after="0" w:line="240" w:lineRule="auto"/>
+              <w:rPr>
+                <w:rFonts w:ascii="Arial" w:eastAsia="Times New Roman" w:hAnsi="Arial" w:cs="Arial"/>
+                <w:color w:val="1F1F1F"/>
+                <w:kern w:val="0"/>
+                <w:sz w:val="22"/>
+                <w:szCs w:val="22"/>
+                <w:lang w:eastAsia="fr-CH"/>
+                <w14:ligatures w14:val="none"/>
+              </w:rPr>
+            </w:pPr>
+            <w:r>
+              <w:rPr>
+                <w:rFonts w:ascii="Arial" w:eastAsia="Times New Roman" w:hAnsi="Arial" w:cs="Arial"/>
+                <w:color w:val="1F1F1F"/>
+                <w:kern w:val="0"/>
+                <w:sz w:val="22"/>
+                <w:szCs w:val="22"/>
+                <w:lang w:eastAsia="fr-CH"/>
+                <w14:ligatures w14:val="none"/>
+              </w:rPr>
+              <w:t>Mineure</w:t>
+            </w:r>
+          </w:p>
+        </w:tc>
+        <w:tc>
+          <w:tcPr>
+            <w:tcW w:w="997" w:type="dxa"/>
+            <w:tcBorders>
+              <w:top w:val="nil"/>
+              <w:left w:val="nil"/>
+              <w:bottom w:val="single" w:sz="8" w:space="0" w:color="000000"/>
+              <w:right w:val="single" w:sz="8" w:space="0" w:color="000000"/>
+            </w:tcBorders>
+            <w:shd w:val="clear" w:color="auto" w:fill="auto"/>
+            <w:hideMark/>
+          </w:tcPr>
+          <w:p>
+            <w:pPr>
+              <w:spacing w:after="0" w:line="240" w:lineRule="auto"/>
+              <w:rPr>
+                <w:rFonts w:ascii="Arial" w:eastAsia="Times New Roman" w:hAnsi="Arial" w:cs="Arial"/>
+                <w:color w:val="1F1F1F"/>
+                <w:kern w:val="0"/>
+                <w:sz w:val="22"/>
+                <w:szCs w:val="22"/>
+                <w:lang w:eastAsia="fr-CH"/>
+                <w14:ligatures w14:val="none"/>
+              </w:rPr>
+            </w:pPr>
+            <w:r>
+              <w:rPr>
+                <w:rFonts w:ascii="Arial" w:eastAsia="Times New Roman" w:hAnsi="Arial" w:cs="Arial"/>
+                <w:color w:val="1F1F1F"/>
+                <w:kern w:val="0"/>
+                <w:sz w:val="22"/>
+                <w:szCs w:val="22"/>
+                <w:lang w:eastAsia="fr-CH"/>
+                <w14:ligatures w14:val="none"/>
+              </w:rPr>
+              <w:t>Mineure</w:t>
+            </w:r>
+          </w:p>
+        </w:tc>
+        <w:tc>
+          <w:tcPr>
+            <w:tcW w:w="1046" w:type="dxa"/>
+            <w:tcBorders>
+              <w:top w:val="nil"/>
+              <w:left w:val="nil"/>
+              <w:bottom w:val="single" w:sz="8" w:space="0" w:color="000000"/>
+              <w:right w:val="single" w:sz="8" w:space="0" w:color="000000"/>
+            </w:tcBorders>
+            <w:shd w:val="clear" w:color="auto" w:fill="auto"/>
+            <w:hideMark/>
+          </w:tcPr>
+          <w:p>
+            <w:pPr>
+              <w:spacing w:after="0" w:line="240" w:lineRule="auto"/>
+              <w:rPr>
+                <w:rFonts w:ascii="Arial" w:eastAsia="Times New Roman" w:hAnsi="Arial" w:cs="Arial"/>
+                <w:color w:val="1F1F1F"/>
+                <w:kern w:val="0"/>
+                <w:sz w:val="22"/>
+                <w:szCs w:val="22"/>
+                <w:lang w:eastAsia="fr-CH"/>
+                <w14:ligatures w14:val="none"/>
+              </w:rPr>
+            </w:pPr>
+            <w:r>
+              <w:rPr>
+                <w:rFonts w:ascii="Arial" w:eastAsia="Times New Roman" w:hAnsi="Arial" w:cs="Arial"/>
+                <w:color w:val="1F1F1F"/>
+                <w:kern w:val="0"/>
+                <w:sz w:val="22"/>
+                <w:szCs w:val="22"/>
+                <w:lang w:eastAsia="fr-CH"/>
+                <w14:ligatures w14:val="none"/>
+              </w:rPr>
+              <w:t>Moyenne</w:t>
+            </w:r>
+          </w:p>
+        </w:tc>
+      </w:tr>
+      <w:tr>
+        <w:trPr>
+          <w:trHeight w:val="2865"/>
+        </w:trPr>
+        <w:tc>
+          <w:tcPr>
+            <w:tcW w:w="385" w:type="dxa"/>
+            <w:tcBorders>
+              <w:top w:val="nil"/>
+              <w:left w:val="single" w:sz="8" w:space="0" w:color="000000"/>
+              <w:bottom w:val="single" w:sz="8" w:space="0" w:color="000000"/>
+              <w:right w:val="single" w:sz="8" w:space="0" w:color="000000"/>
+            </w:tcBorders>
+            <w:shd w:val="clear" w:color="auto" w:fill="auto"/>
+            <w:hideMark/>
+          </w:tcPr>
+          <w:p>
+            <w:pPr>
+              <w:spacing w:after="0" w:line="240" w:lineRule="auto"/>
+              <w:rPr>
+                <w:rFonts w:ascii="Arial" w:eastAsia="Times New Roman" w:hAnsi="Arial" w:cs="Arial"/>
+                <w:b/>
+                <w:bCs/>
+                <w:color w:val="1F1F1F"/>
+                <w:kern w:val="0"/>
+                <w:sz w:val="22"/>
+                <w:szCs w:val="22"/>
+                <w:lang w:eastAsia="fr-CH"/>
+                <w14:ligatures w14:val="none"/>
+              </w:rPr>
+            </w:pPr>
+            <w:r>
+              <w:rPr>
+                <w:rFonts w:ascii="Arial" w:eastAsia="Times New Roman" w:hAnsi="Arial" w:cs="Arial"/>
+                <w:b/>
+                <w:bCs/>
+                <w:color w:val="1F1F1F"/>
+                <w:kern w:val="0"/>
+                <w:sz w:val="22"/>
+                <w:szCs w:val="22"/>
+                <w:lang w:eastAsia="fr-CH"/>
+                <w14:ligatures w14:val="none"/>
+              </w:rPr>
+              <w:t>B-06</w:t>
+            </w:r>
+          </w:p>
+        </w:tc>
+        <w:tc>
+          <w:tcPr>
+            <w:tcW w:w="1620" w:type="dxa"/>
+            <w:tcBorders>
+              <w:top w:val="nil"/>
+              <w:left w:val="nil"/>
+              <w:bottom w:val="single" w:sz="8" w:space="0" w:color="000000"/>
+              <w:right w:val="single" w:sz="8" w:space="0" w:color="000000"/>
+            </w:tcBorders>
+            <w:shd w:val="clear" w:color="auto" w:fill="auto"/>
+            <w:hideMark/>
+          </w:tcPr>
+          <w:p>
+            <w:pPr>
+              <w:spacing w:after="0" w:line="240" w:lineRule="auto"/>
+              <w:rPr>
+                <w:rFonts w:ascii="Arial" w:eastAsia="Times New Roman" w:hAnsi="Arial" w:cs="Arial"/>
+                <w:b/>
+                <w:bCs/>
+                <w:color w:val="1F1F1F"/>
+                <w:kern w:val="0"/>
+                <w:sz w:val="22"/>
+                <w:szCs w:val="22"/>
+                <w:lang w:eastAsia="fr-CH"/>
+                <w14:ligatures w14:val="none"/>
+              </w:rPr>
+            </w:pPr>
+            <w:r>
+              <w:rPr>
+                <w:rFonts w:ascii="Arial" w:eastAsia="Times New Roman" w:hAnsi="Arial" w:cs="Arial"/>
+                <w:b/>
+                <w:bCs/>
+                <w:color w:val="1F1F1F"/>
+                <w:kern w:val="0"/>
+                <w:sz w:val="22"/>
+                <w:szCs w:val="22"/>
+                <w:lang w:eastAsia="fr-CH"/>
+                <w14:ligatures w14:val="none"/>
+              </w:rPr>
+              <w:t>Erreur de frappe dans l'UI (Fautes)</w:t>
+            </w:r>
+          </w:p>
+        </w:tc>
+        <w:tc>
+          <w:tcPr>
+            <w:tcW w:w="1681" w:type="dxa"/>
+            <w:tcBorders>
+              <w:top w:val="nil"/>
+              <w:left w:val="nil"/>
+              <w:bottom w:val="single" w:sz="8" w:space="0" w:color="000000"/>
+              <w:right w:val="single" w:sz="8" w:space="0" w:color="000000"/>
+            </w:tcBorders>
+            <w:shd w:val="clear" w:color="auto" w:fill="auto"/>
+            <w:hideMark/>
+          </w:tcPr>
+          <w:p>
+            <w:pPr>
+              <w:spacing w:after="0" w:line="240" w:lineRule="auto"/>
+              <w:rPr>
+                <w:rFonts w:ascii="Arial" w:eastAsia="Times New Roman" w:hAnsi="Arial" w:cs="Arial"/>
+                <w:color w:val="1F1F1F"/>
+                <w:kern w:val="0"/>
+                <w:sz w:val="22"/>
+                <w:szCs w:val="22"/>
+                <w:lang w:eastAsia="fr-CH"/>
+                <w14:ligatures w14:val="none"/>
+              </w:rPr>
+            </w:pPr>
+            <w:r>
+              <w:rPr>
+                <w:rFonts w:ascii="Arial" w:eastAsia="Times New Roman" w:hAnsi="Arial" w:cs="Arial"/>
+                <w:color w:val="1F1F1F"/>
+                <w:kern w:val="0"/>
+                <w:sz w:val="22"/>
+                <w:szCs w:val="22"/>
+                <w:lang w:eastAsia="fr-CH"/>
+                <w14:ligatures w14:val="none"/>
+              </w:rPr>
+              <w:t>1. Provoquer une erreur (</w:t>
+            </w:r>
+            <w:proofErr w:type="gramStart"/>
+            <w:r>
+              <w:rPr>
+                <w:rFonts w:ascii="Arial" w:eastAsia="Times New Roman" w:hAnsi="Arial" w:cs="Arial"/>
+                <w:color w:val="1F1F1F"/>
+                <w:kern w:val="0"/>
+                <w:sz w:val="22"/>
+                <w:szCs w:val="22"/>
+                <w:lang w:eastAsia="fr-CH"/>
+                <w14:ligatures w14:val="none"/>
+              </w:rPr>
+              <w:t>ex:</w:t>
+            </w:r>
+            <w:proofErr w:type="gramEnd"/>
+            <w:r>
+              <w:rPr>
+                <w:rFonts w:ascii="Arial" w:eastAsia="Times New Roman" w:hAnsi="Arial" w:cs="Arial"/>
+                <w:color w:val="1F1F1F"/>
+                <w:kern w:val="0"/>
+                <w:sz w:val="22"/>
+                <w:szCs w:val="22"/>
+                <w:lang w:eastAsia="fr-CH"/>
+                <w14:ligatures w14:val="none"/>
+              </w:rPr>
+              <w:t xml:space="preserve"> échec API). 2. Regarder le message d'erreur affiché.</w:t>
+            </w:r>
+          </w:p>
+        </w:tc>
+        <w:tc>
+          <w:tcPr>
+            <w:tcW w:w="1522" w:type="dxa"/>
+            <w:tcBorders>
+              <w:top w:val="nil"/>
+              <w:left w:val="nil"/>
+              <w:bottom w:val="single" w:sz="8" w:space="0" w:color="000000"/>
+              <w:right w:val="single" w:sz="8" w:space="0" w:color="000000"/>
+            </w:tcBorders>
+            <w:shd w:val="clear" w:color="auto" w:fill="auto"/>
+            <w:hideMark/>
+          </w:tcPr>
+          <w:p>
+            <w:pPr>
+              <w:spacing w:after="0" w:line="240" w:lineRule="auto"/>
+              <w:rPr>
+                <w:rFonts w:ascii="Arial" w:eastAsia="Times New Roman" w:hAnsi="Arial" w:cs="Arial"/>
+                <w:color w:val="1F1F1F"/>
+                <w:kern w:val="0"/>
+                <w:sz w:val="22"/>
+                <w:szCs w:val="22"/>
+                <w:lang w:eastAsia="fr-CH"/>
+                <w14:ligatures w14:val="none"/>
+              </w:rPr>
+            </w:pPr>
+            <w:r>
+              <w:rPr>
+                <w:rFonts w:ascii="Arial" w:eastAsia="Times New Roman" w:hAnsi="Arial" w:cs="Arial"/>
+                <w:color w:val="1F1F1F"/>
+                <w:kern w:val="0"/>
+                <w:sz w:val="22"/>
+                <w:szCs w:val="22"/>
+                <w:lang w:eastAsia="fr-CH"/>
+                <w14:ligatures w14:val="none"/>
+              </w:rPr>
+              <w:t>Message "Erreur : [message]".</w:t>
+            </w:r>
+          </w:p>
+        </w:tc>
+        <w:tc>
+          <w:tcPr>
+            <w:tcW w:w="1351" w:type="dxa"/>
+            <w:tcBorders>
+              <w:top w:val="nil"/>
+              <w:left w:val="nil"/>
+              <w:bottom w:val="single" w:sz="8" w:space="0" w:color="000000"/>
+              <w:right w:val="single" w:sz="8" w:space="0" w:color="000000"/>
+            </w:tcBorders>
+            <w:shd w:val="clear" w:color="auto" w:fill="auto"/>
+            <w:hideMark/>
+          </w:tcPr>
+          <w:p>
+            <w:pPr>
+              <w:spacing w:after="0" w:line="240" w:lineRule="auto"/>
+              <w:rPr>
+                <w:rFonts w:ascii="Arial" w:eastAsia="Times New Roman" w:hAnsi="Arial" w:cs="Arial"/>
+                <w:color w:val="1F1F1F"/>
+                <w:kern w:val="0"/>
+                <w:sz w:val="22"/>
+                <w:szCs w:val="22"/>
+                <w:lang w:eastAsia="fr-CH"/>
+                <w14:ligatures w14:val="none"/>
+              </w:rPr>
+            </w:pPr>
+            <w:r>
+              <w:rPr>
+                <w:rFonts w:ascii="Arial" w:eastAsia="Times New Roman" w:hAnsi="Arial" w:cs="Arial"/>
+                <w:color w:val="1F1F1F"/>
+                <w:kern w:val="0"/>
+                <w:sz w:val="22"/>
+                <w:szCs w:val="22"/>
+                <w:lang w:eastAsia="fr-CH"/>
+                <w14:ligatures w14:val="none"/>
+              </w:rPr>
+              <w:t>Le message affiche "</w:t>
+            </w:r>
+            <w:proofErr w:type="spellStart"/>
+            <w:r>
+              <w:rPr>
+                <w:rFonts w:ascii="Arial" w:eastAsia="Times New Roman" w:hAnsi="Arial" w:cs="Arial"/>
+                <w:color w:val="1F1F1F"/>
+                <w:kern w:val="0"/>
+                <w:sz w:val="22"/>
+                <w:szCs w:val="22"/>
+                <w:lang w:eastAsia="fr-CH"/>
+                <w14:ligatures w14:val="none"/>
+              </w:rPr>
+              <w:t>Erreuur</w:t>
+            </w:r>
+            <w:proofErr w:type="spellEnd"/>
+            <w:r>
+              <w:rPr>
+                <w:rFonts w:ascii="Arial" w:eastAsia="Times New Roman" w:hAnsi="Arial" w:cs="Arial"/>
+                <w:color w:val="1F1F1F"/>
+                <w:kern w:val="0"/>
+                <w:sz w:val="22"/>
+                <w:szCs w:val="22"/>
+                <w:lang w:eastAsia="fr-CH"/>
+                <w14:ligatures w14:val="none"/>
+              </w:rPr>
+              <w:t xml:space="preserve"> :" avec deux 'u'.</w:t>
+            </w:r>
+          </w:p>
+        </w:tc>
+        <w:tc>
+          <w:tcPr>
+            <w:tcW w:w="1314" w:type="dxa"/>
+            <w:tcBorders>
+              <w:top w:val="nil"/>
+              <w:left w:val="nil"/>
+              <w:bottom w:val="single" w:sz="8" w:space="0" w:color="000000"/>
+              <w:right w:val="single" w:sz="8" w:space="0" w:color="000000"/>
+            </w:tcBorders>
+            <w:shd w:val="clear" w:color="auto" w:fill="auto"/>
+            <w:hideMark/>
+          </w:tcPr>
+          <w:p>
+            <w:pPr>
+              <w:spacing w:after="0" w:line="240" w:lineRule="auto"/>
+              <w:rPr>
+                <w:rFonts w:ascii="Arial" w:eastAsia="Times New Roman" w:hAnsi="Arial" w:cs="Arial"/>
+                <w:color w:val="1F1F1F"/>
+                <w:kern w:val="0"/>
+                <w:sz w:val="22"/>
+                <w:szCs w:val="22"/>
+                <w:lang w:eastAsia="fr-CH"/>
+                <w14:ligatures w14:val="none"/>
+              </w:rPr>
+            </w:pPr>
+            <w:r>
+              <w:rPr>
+                <w:rFonts w:ascii="Arial" w:eastAsia="Times New Roman" w:hAnsi="Arial" w:cs="Arial"/>
+                <w:color w:val="1F1F1F"/>
+                <w:kern w:val="0"/>
+                <w:sz w:val="22"/>
+                <w:szCs w:val="22"/>
+                <w:lang w:eastAsia="fr-CH"/>
+                <w14:ligatures w14:val="none"/>
+              </w:rPr>
+              <w:t>Cosmétique</w:t>
+            </w:r>
+          </w:p>
+        </w:tc>
+        <w:tc>
+          <w:tcPr>
+            <w:tcW w:w="997" w:type="dxa"/>
+            <w:tcBorders>
+              <w:top w:val="nil"/>
+              <w:left w:val="nil"/>
+              <w:bottom w:val="single" w:sz="8" w:space="0" w:color="000000"/>
+              <w:right w:val="single" w:sz="8" w:space="0" w:color="000000"/>
+            </w:tcBorders>
+            <w:shd w:val="clear" w:color="auto" w:fill="auto"/>
+            <w:hideMark/>
+          </w:tcPr>
+          <w:p>
+            <w:pPr>
+              <w:spacing w:after="0" w:line="240" w:lineRule="auto"/>
+              <w:rPr>
+                <w:rFonts w:ascii="Arial" w:eastAsia="Times New Roman" w:hAnsi="Arial" w:cs="Arial"/>
+                <w:color w:val="1F1F1F"/>
+                <w:kern w:val="0"/>
+                <w:sz w:val="22"/>
+                <w:szCs w:val="22"/>
+                <w:lang w:eastAsia="fr-CH"/>
+                <w14:ligatures w14:val="none"/>
+              </w:rPr>
+            </w:pPr>
+            <w:r>
+              <w:rPr>
+                <w:rFonts w:ascii="Arial" w:eastAsia="Times New Roman" w:hAnsi="Arial" w:cs="Arial"/>
+                <w:color w:val="1F1F1F"/>
+                <w:kern w:val="0"/>
+                <w:sz w:val="22"/>
+                <w:szCs w:val="22"/>
+                <w:lang w:eastAsia="fr-CH"/>
+                <w14:ligatures w14:val="none"/>
+              </w:rPr>
+              <w:t>Triviale</w:t>
+            </w:r>
+          </w:p>
+        </w:tc>
+        <w:tc>
+          <w:tcPr>
+            <w:tcW w:w="1046" w:type="dxa"/>
+            <w:tcBorders>
+              <w:top w:val="nil"/>
+              <w:left w:val="nil"/>
+              <w:bottom w:val="single" w:sz="8" w:space="0" w:color="000000"/>
+              <w:right w:val="single" w:sz="8" w:space="0" w:color="000000"/>
+            </w:tcBorders>
+            <w:shd w:val="clear" w:color="auto" w:fill="auto"/>
+            <w:hideMark/>
+          </w:tcPr>
+          <w:p>
+            <w:pPr>
+              <w:spacing w:after="0" w:line="240" w:lineRule="auto"/>
+              <w:rPr>
+                <w:rFonts w:ascii="Arial" w:eastAsia="Times New Roman" w:hAnsi="Arial" w:cs="Arial"/>
+                <w:color w:val="1F1F1F"/>
+                <w:kern w:val="0"/>
+                <w:sz w:val="22"/>
+                <w:szCs w:val="22"/>
+                <w:lang w:eastAsia="fr-CH"/>
+                <w14:ligatures w14:val="none"/>
+              </w:rPr>
+            </w:pPr>
+            <w:r>
+              <w:rPr>
+                <w:rFonts w:ascii="Arial" w:eastAsia="Times New Roman" w:hAnsi="Arial" w:cs="Arial"/>
+                <w:color w:val="1F1F1F"/>
+                <w:kern w:val="0"/>
+                <w:sz w:val="22"/>
+                <w:szCs w:val="22"/>
+                <w:lang w:eastAsia="fr-CH"/>
+                <w14:ligatures w14:val="none"/>
+              </w:rPr>
+              <w:t>Basse</w:t>
+            </w:r>
+          </w:p>
+        </w:tc>
+      </w:tr>
+      <w:tr>
+        <w:trPr>
+          <w:trHeight w:val="2010"/>
+        </w:trPr>
+        <w:tc>
+          <w:tcPr>
+            <w:tcW w:w="385" w:type="dxa"/>
+            <w:tcBorders>
+              <w:top w:val="nil"/>
+              <w:left w:val="single" w:sz="8" w:space="0" w:color="000000"/>
+              <w:bottom w:val="single" w:sz="8" w:space="0" w:color="000000"/>
+              <w:right w:val="single" w:sz="8" w:space="0" w:color="000000"/>
+            </w:tcBorders>
+            <w:shd w:val="clear" w:color="auto" w:fill="auto"/>
+            <w:hideMark/>
+          </w:tcPr>
+          <w:p>
+            <w:pPr>
+              <w:spacing w:after="0" w:line="240" w:lineRule="auto"/>
+              <w:rPr>
+                <w:rFonts w:ascii="Arial" w:eastAsia="Times New Roman" w:hAnsi="Arial" w:cs="Arial"/>
+                <w:b/>
+                <w:bCs/>
+                <w:color w:val="1F1F1F"/>
+                <w:kern w:val="0"/>
+                <w:sz w:val="22"/>
+                <w:szCs w:val="22"/>
+                <w:lang w:eastAsia="fr-CH"/>
+                <w14:ligatures w14:val="none"/>
+              </w:rPr>
+            </w:pPr>
+            <w:r>
+              <w:rPr>
+                <w:rFonts w:ascii="Arial" w:eastAsia="Times New Roman" w:hAnsi="Arial" w:cs="Arial"/>
+                <w:b/>
+                <w:bCs/>
+                <w:color w:val="1F1F1F"/>
+                <w:kern w:val="0"/>
+                <w:sz w:val="22"/>
+                <w:szCs w:val="22"/>
+                <w:lang w:eastAsia="fr-CH"/>
+                <w14:ligatures w14:val="none"/>
+              </w:rPr>
+              <w:t>B-07</w:t>
+            </w:r>
+          </w:p>
+        </w:tc>
+        <w:tc>
+          <w:tcPr>
+            <w:tcW w:w="1620" w:type="dxa"/>
+            <w:tcBorders>
+              <w:top w:val="nil"/>
+              <w:left w:val="nil"/>
+              <w:bottom w:val="single" w:sz="8" w:space="0" w:color="000000"/>
+              <w:right w:val="single" w:sz="8" w:space="0" w:color="000000"/>
+            </w:tcBorders>
+            <w:shd w:val="clear" w:color="auto" w:fill="auto"/>
+            <w:hideMark/>
+          </w:tcPr>
+          <w:p>
+            <w:pPr>
+              <w:spacing w:after="0" w:line="240" w:lineRule="auto"/>
+              <w:rPr>
+                <w:rFonts w:ascii="Arial" w:eastAsia="Times New Roman" w:hAnsi="Arial" w:cs="Arial"/>
+                <w:b/>
+                <w:bCs/>
+                <w:color w:val="1F1F1F"/>
+                <w:kern w:val="0"/>
+                <w:sz w:val="22"/>
+                <w:szCs w:val="22"/>
+                <w:lang w:eastAsia="fr-CH"/>
+                <w14:ligatures w14:val="none"/>
+              </w:rPr>
+            </w:pPr>
+            <w:r>
+              <w:rPr>
+                <w:rFonts w:ascii="Arial" w:eastAsia="Times New Roman" w:hAnsi="Arial" w:cs="Arial"/>
+                <w:b/>
+                <w:bCs/>
+                <w:color w:val="1F1F1F"/>
+                <w:kern w:val="0"/>
+                <w:sz w:val="22"/>
+                <w:szCs w:val="22"/>
+                <w:lang w:eastAsia="fr-CH"/>
+                <w14:ligatures w14:val="none"/>
+              </w:rPr>
+              <w:t>Absence de validation de date (Passé)</w:t>
+            </w:r>
+          </w:p>
+        </w:tc>
+        <w:tc>
+          <w:tcPr>
+            <w:tcW w:w="1681" w:type="dxa"/>
+            <w:tcBorders>
+              <w:top w:val="nil"/>
+              <w:left w:val="nil"/>
+              <w:bottom w:val="single" w:sz="8" w:space="0" w:color="000000"/>
+              <w:right w:val="single" w:sz="8" w:space="0" w:color="000000"/>
+            </w:tcBorders>
+            <w:shd w:val="clear" w:color="auto" w:fill="auto"/>
+            <w:hideMark/>
+          </w:tcPr>
+          <w:p>
+            <w:pPr>
+              <w:spacing w:after="0" w:line="240" w:lineRule="auto"/>
+              <w:rPr>
+                <w:rFonts w:ascii="Arial" w:eastAsia="Times New Roman" w:hAnsi="Arial" w:cs="Arial"/>
+                <w:color w:val="1F1F1F"/>
+                <w:kern w:val="0"/>
+                <w:sz w:val="22"/>
+                <w:szCs w:val="22"/>
+                <w:lang w:eastAsia="fr-CH"/>
+                <w14:ligatures w14:val="none"/>
+              </w:rPr>
+            </w:pPr>
+            <w:r>
+              <w:rPr>
+                <w:rFonts w:ascii="Arial" w:eastAsia="Times New Roman" w:hAnsi="Arial" w:cs="Arial"/>
+                <w:color w:val="1F1F1F"/>
+                <w:kern w:val="0"/>
+                <w:sz w:val="22"/>
+                <w:szCs w:val="22"/>
+                <w:lang w:eastAsia="fr-CH"/>
+                <w14:ligatures w14:val="none"/>
+              </w:rPr>
+              <w:t xml:space="preserve">1. Créer une tâche via l'API avec une </w:t>
+            </w:r>
+            <w:proofErr w:type="spellStart"/>
+            <w:r>
+              <w:rPr>
+                <w:rFonts w:ascii="Arial" w:eastAsia="Times New Roman" w:hAnsi="Arial" w:cs="Arial"/>
+                <w:color w:val="444746"/>
+                <w:kern w:val="0"/>
+                <w:sz w:val="20"/>
+                <w:szCs w:val="20"/>
+                <w:lang w:eastAsia="fr-CH"/>
+                <w14:ligatures w14:val="none"/>
+              </w:rPr>
+              <w:t>dueDate</w:t>
+            </w:r>
+            <w:proofErr w:type="spellEnd"/>
+            <w:r>
+              <w:rPr>
+                <w:rFonts w:ascii="Arial" w:eastAsia="Times New Roman" w:hAnsi="Arial" w:cs="Arial"/>
+                <w:color w:val="1F1F1F"/>
+                <w:kern w:val="0"/>
+                <w:sz w:val="22"/>
+                <w:szCs w:val="22"/>
+                <w:lang w:eastAsia="fr-CH"/>
+                <w14:ligatures w14:val="none"/>
+              </w:rPr>
+              <w:t xml:space="preserve"> dans le passé.</w:t>
+            </w:r>
+          </w:p>
+        </w:tc>
+        <w:tc>
+          <w:tcPr>
+            <w:tcW w:w="1522" w:type="dxa"/>
+            <w:tcBorders>
+              <w:top w:val="nil"/>
+              <w:left w:val="nil"/>
+              <w:bottom w:val="single" w:sz="8" w:space="0" w:color="000000"/>
+              <w:right w:val="single" w:sz="8" w:space="0" w:color="000000"/>
+            </w:tcBorders>
+            <w:shd w:val="clear" w:color="auto" w:fill="auto"/>
+            <w:hideMark/>
+          </w:tcPr>
+          <w:p>
+            <w:pPr>
+              <w:spacing w:after="0" w:line="240" w:lineRule="auto"/>
+              <w:rPr>
+                <w:rFonts w:ascii="Arial" w:eastAsia="Times New Roman" w:hAnsi="Arial" w:cs="Arial"/>
+                <w:color w:val="1F1F1F"/>
+                <w:kern w:val="0"/>
+                <w:sz w:val="22"/>
+                <w:szCs w:val="22"/>
+                <w:lang w:eastAsia="fr-CH"/>
+                <w14:ligatures w14:val="none"/>
+              </w:rPr>
+            </w:pPr>
+            <w:r>
+              <w:rPr>
+                <w:rFonts w:ascii="Arial" w:eastAsia="Times New Roman" w:hAnsi="Arial" w:cs="Arial"/>
+                <w:color w:val="1F1F1F"/>
+                <w:kern w:val="0"/>
+                <w:sz w:val="22"/>
+                <w:szCs w:val="22"/>
+                <w:lang w:eastAsia="fr-CH"/>
+                <w14:ligatures w14:val="none"/>
+              </w:rPr>
+              <w:t>L'API doit rejeter les dates antérieures à aujourd'hui.</w:t>
+            </w:r>
+          </w:p>
+        </w:tc>
+        <w:tc>
+          <w:tcPr>
+            <w:tcW w:w="1351" w:type="dxa"/>
+            <w:tcBorders>
+              <w:top w:val="nil"/>
+              <w:left w:val="nil"/>
+              <w:bottom w:val="single" w:sz="8" w:space="0" w:color="000000"/>
+              <w:right w:val="single" w:sz="8" w:space="0" w:color="000000"/>
+            </w:tcBorders>
+            <w:shd w:val="clear" w:color="auto" w:fill="auto"/>
+            <w:hideMark/>
+          </w:tcPr>
+          <w:p>
+            <w:pPr>
+              <w:spacing w:after="0" w:line="240" w:lineRule="auto"/>
+              <w:rPr>
+                <w:rFonts w:ascii="Arial" w:eastAsia="Times New Roman" w:hAnsi="Arial" w:cs="Arial"/>
+                <w:color w:val="1F1F1F"/>
+                <w:kern w:val="0"/>
+                <w:sz w:val="22"/>
+                <w:szCs w:val="22"/>
+                <w:lang w:eastAsia="fr-CH"/>
+                <w14:ligatures w14:val="none"/>
+              </w:rPr>
+            </w:pPr>
+            <w:r>
+              <w:rPr>
+                <w:rFonts w:ascii="Arial" w:eastAsia="Times New Roman" w:hAnsi="Arial" w:cs="Arial"/>
+                <w:color w:val="1F1F1F"/>
+                <w:kern w:val="0"/>
+                <w:sz w:val="22"/>
+                <w:szCs w:val="22"/>
+                <w:lang w:eastAsia="fr-CH"/>
+                <w14:ligatures w14:val="none"/>
+              </w:rPr>
+              <w:t>Le validateur ne vérifie pas la cohérence temporelle de la date.</w:t>
+            </w:r>
+          </w:p>
+        </w:tc>
+        <w:tc>
+          <w:tcPr>
+            <w:tcW w:w="1314" w:type="dxa"/>
+            <w:tcBorders>
+              <w:top w:val="nil"/>
+              <w:left w:val="nil"/>
+              <w:bottom w:val="single" w:sz="8" w:space="0" w:color="000000"/>
+              <w:right w:val="single" w:sz="8" w:space="0" w:color="000000"/>
+            </w:tcBorders>
+            <w:shd w:val="clear" w:color="auto" w:fill="auto"/>
+            <w:hideMark/>
+          </w:tcPr>
+          <w:p>
+            <w:pPr>
+              <w:spacing w:after="0" w:line="240" w:lineRule="auto"/>
+              <w:rPr>
+                <w:rFonts w:ascii="Arial" w:eastAsia="Times New Roman" w:hAnsi="Arial" w:cs="Arial"/>
+                <w:color w:val="1F1F1F"/>
+                <w:kern w:val="0"/>
+                <w:sz w:val="22"/>
+                <w:szCs w:val="22"/>
+                <w:lang w:eastAsia="fr-CH"/>
+                <w14:ligatures w14:val="none"/>
+              </w:rPr>
+            </w:pPr>
+            <w:r>
+              <w:rPr>
+                <w:rFonts w:ascii="Arial" w:eastAsia="Times New Roman" w:hAnsi="Arial" w:cs="Arial"/>
+                <w:color w:val="1F1F1F"/>
+                <w:kern w:val="0"/>
+                <w:sz w:val="22"/>
+                <w:szCs w:val="22"/>
+                <w:lang w:eastAsia="fr-CH"/>
+                <w14:ligatures w14:val="none"/>
+              </w:rPr>
+              <w:t>Sérieuse</w:t>
+            </w:r>
+          </w:p>
+        </w:tc>
+        <w:tc>
+          <w:tcPr>
+            <w:tcW w:w="997" w:type="dxa"/>
+            <w:tcBorders>
+              <w:top w:val="nil"/>
+              <w:left w:val="nil"/>
+              <w:bottom w:val="single" w:sz="8" w:space="0" w:color="000000"/>
+              <w:right w:val="single" w:sz="8" w:space="0" w:color="000000"/>
+            </w:tcBorders>
+            <w:shd w:val="clear" w:color="auto" w:fill="auto"/>
+            <w:hideMark/>
+          </w:tcPr>
+          <w:p>
+            <w:pPr>
+              <w:spacing w:after="0" w:line="240" w:lineRule="auto"/>
+              <w:rPr>
+                <w:rFonts w:ascii="Arial" w:eastAsia="Times New Roman" w:hAnsi="Arial" w:cs="Arial"/>
+                <w:color w:val="1F1F1F"/>
+                <w:kern w:val="0"/>
+                <w:sz w:val="22"/>
+                <w:szCs w:val="22"/>
+                <w:lang w:eastAsia="fr-CH"/>
+                <w14:ligatures w14:val="none"/>
+              </w:rPr>
+            </w:pPr>
+            <w:r>
+              <w:rPr>
+                <w:rFonts w:ascii="Arial" w:eastAsia="Times New Roman" w:hAnsi="Arial" w:cs="Arial"/>
+                <w:color w:val="1F1F1F"/>
+                <w:kern w:val="0"/>
+                <w:sz w:val="22"/>
+                <w:szCs w:val="22"/>
+                <w:lang w:eastAsia="fr-CH"/>
+                <w14:ligatures w14:val="none"/>
+              </w:rPr>
+              <w:t>Mineure</w:t>
+            </w:r>
+          </w:p>
+        </w:tc>
+        <w:tc>
+          <w:tcPr>
+            <w:tcW w:w="1046" w:type="dxa"/>
+            <w:tcBorders>
+              <w:top w:val="nil"/>
+              <w:left w:val="nil"/>
+              <w:bottom w:val="single" w:sz="8" w:space="0" w:color="000000"/>
+              <w:right w:val="single" w:sz="8" w:space="0" w:color="000000"/>
+            </w:tcBorders>
+            <w:shd w:val="clear" w:color="auto" w:fill="auto"/>
+            <w:hideMark/>
+          </w:tcPr>
+          <w:p>
+            <w:pPr>
+              <w:spacing w:after="0" w:line="240" w:lineRule="auto"/>
+              <w:rPr>
+                <w:rFonts w:ascii="Arial" w:eastAsia="Times New Roman" w:hAnsi="Arial" w:cs="Arial"/>
+                <w:color w:val="1F1F1F"/>
+                <w:kern w:val="0"/>
+                <w:sz w:val="22"/>
+                <w:szCs w:val="22"/>
+                <w:lang w:eastAsia="fr-CH"/>
+                <w14:ligatures w14:val="none"/>
+              </w:rPr>
+            </w:pPr>
+            <w:r>
+              <w:rPr>
+                <w:rFonts w:ascii="Arial" w:eastAsia="Times New Roman" w:hAnsi="Arial" w:cs="Arial"/>
+                <w:color w:val="1F1F1F"/>
+                <w:kern w:val="0"/>
+                <w:sz w:val="22"/>
+                <w:szCs w:val="22"/>
+                <w:lang w:eastAsia="fr-CH"/>
+                <w14:ligatures w14:val="none"/>
+              </w:rPr>
+              <w:t>Moyenne</w:t>
+            </w:r>
+          </w:p>
+        </w:tc>
+      </w:tr>
+    </w:tbl>
     <w:p>
       <w:pPr>
-        <w:pStyle w:val="Titre2"/>
-        <w:numPr>
-          <w:ilvl w:val="0"/>
-          <w:numId w:val="2"/>
-        </w:numPr>
+        <w:rPr>
+          <w:b/>
+          <w:bCs/>
+        </w:rPr>
+      </w:pPr>
+    </w:p>
+    <w:p>
+      <w:pPr>
+        <w:rPr>
+          <w:b/>
+          <w:bCs/>
+        </w:rPr>
+      </w:pPr>
+    </w:p>
+    <w:p>
+      <w:pPr>
+        <w:rPr>
+          <w:b/>
+          <w:bCs/>
+        </w:rPr>
+      </w:pPr>
+    </w:p>
+    <w:p>
+      <w:pPr>
+        <w:rPr>
+          <w:b/>
+          <w:bCs/>
+        </w:rPr>
+      </w:pPr>
+    </w:p>
+    <w:p>
+      <w:pPr>
+        <w:rPr>
+          <w:b/>
+          <w:bCs/>
+        </w:rPr>
+      </w:pPr>
+    </w:p>
+    <w:p>
+      <w:pPr>
+        <w:rPr>
+          <w:b/>
+          <w:bCs/>
+        </w:rPr>
+      </w:pPr>
+    </w:p>
+    <w:p>
+      <w:pPr>
+        <w:rPr>
+          <w:b/>
+          <w:bCs/>
+        </w:rPr>
+      </w:pPr>
+    </w:p>
+    <w:p>
+      <w:pPr>
+        <w:jc w:val="both"/>
+        <w:rPr>
+          <w:b/>
+          <w:bCs/>
+        </w:rPr>
       </w:pPr>
       <w:r>
-        <w:t>Infrastructure Docker</w:t>
+        <w:rPr>
+          <w:b/>
+          <w:bCs/>
+        </w:rPr>
+        <w:lastRenderedPageBreak/>
+        <w:t>Analyse technique complémentaire</w:t>
       </w:r>
     </w:p>
     <w:p>
+      <w:pPr>
+        <w:numPr>
+          <w:ilvl w:val="0"/>
+          <w:numId w:val="4"/>
+        </w:numPr>
+        <w:jc w:val="both"/>
+      </w:pPr>
       <w:r>
-        <w:t>On utilise Docker pour la base de données MySQL.</w:t>
+        <w:rPr>
+          <w:b/>
+          <w:bCs/>
+        </w:rPr>
+        <w:t>Gestion des doublons (B-01) :</w:t>
+      </w:r>
+      <w:r>
+        <w:t xml:space="preserve"> Le code frontend utilise un ajout "optimiste". Cependant, après le succès de la requête </w:t>
+      </w:r>
+      <w:proofErr w:type="spellStart"/>
+      <w:r>
+        <w:t>fetch</w:t>
+      </w:r>
+      <w:proofErr w:type="spellEnd"/>
+      <w:r>
+        <w:t>, l'application ajoute à nouveau l'objet retourné par le serveur sans supprimer l'identifiant temporaire généré aléatoirement, provoquant une désynchronisation de l'état local.</w:t>
       </w:r>
     </w:p>
     <w:p>
+      <w:pPr>
+        <w:numPr>
+          <w:ilvl w:val="0"/>
+          <w:numId w:val="4"/>
+        </w:numPr>
+        <w:jc w:val="both"/>
+      </w:pPr>
       <w:r>
-        <w:t>Pour ce faire, on se place dans le répertoire où se trouve le docker-</w:t>
+        <w:rPr>
+          <w:b/>
+          <w:bCs/>
+        </w:rPr>
+        <w:t>Validateur technique (B-03) :</w:t>
+      </w:r>
+      <w:r>
+        <w:t xml:space="preserve"> L'usage de </w:t>
       </w:r>
       <w:proofErr w:type="spellStart"/>
-      <w:r>
-        <w:t>compose.yml</w:t>
-      </w:r>
-      <w:proofErr w:type="spellEnd"/>
-      <w:r>
-        <w:t xml:space="preserve"> et on ouvre un </w:t>
-      </w:r>
-      <w:proofErr w:type="spellStart"/>
-      <w:r>
-        <w:t>bash</w:t>
-      </w:r>
-      <w:proofErr w:type="spellEnd"/>
-      <w:r>
-        <w:t>. On lance la commande docker-compose up -d.</w:t>
-      </w:r>
-    </w:p>
-    <w:p/>
-    <w:p>
-      <w:pPr>
-        <w:pStyle w:val="Titre2"/>
-        <w:numPr>
-          <w:ilvl w:val="0"/>
-          <w:numId w:val="2"/>
-        </w:numPr>
-      </w:pPr>
-      <w:r>
-        <w:t>Configuration du backend</w:t>
-      </w:r>
-    </w:p>
-    <w:p>
-      <w:r>
-        <w:t xml:space="preserve">Pour la mise en route, on doit créer </w:t>
-      </w:r>
       <w:proofErr w:type="gramStart"/>
       <w:r>
-        <w:t>le .</w:t>
-      </w:r>
-      <w:proofErr w:type="spellStart"/>
-      <w:r>
-        <w:t>env</w:t>
+        <w:t>vine.string</w:t>
       </w:r>
       <w:proofErr w:type="spellEnd"/>
       <w:proofErr w:type="gramEnd"/>
       <w:r>
-        <w:t xml:space="preserve"> à partir du .</w:t>
+        <w:t>().trim().</w:t>
       </w:r>
       <w:proofErr w:type="spellStart"/>
       <w:r>
-        <w:t>env.example</w:t>
+        <w:t>minLength</w:t>
       </w:r>
       <w:proofErr w:type="spellEnd"/>
       <w:r>
-        <w:t xml:space="preserve"> dans l’application sur </w:t>
+        <w:t>(0) est une faille fonctionnelle majeure. Une tâche sans titre devient "invisible" ou impossible à manipuler correctement dans l'interface utilisateur.</w:t>
+      </w:r>
+    </w:p>
+    <w:p>
+      <w:pPr>
+        <w:numPr>
+          <w:ilvl w:val="0"/>
+          <w:numId w:val="4"/>
+        </w:numPr>
+        <w:jc w:val="both"/>
+      </w:pPr>
+      <w:r>
+        <w:rPr>
+          <w:b/>
+          <w:bCs/>
+        </w:rPr>
+        <w:t>Erreur de mapping (B-02) :</w:t>
+      </w:r>
+      <w:r>
+        <w:t xml:space="preserve"> Dans la fonction </w:t>
       </w:r>
       <w:proofErr w:type="spellStart"/>
       <w:r>
-        <w:t>VSCode</w:t>
+        <w:t>saveEdit</w:t>
       </w:r>
       <w:proofErr w:type="spellEnd"/>
       <w:r>
-        <w:t xml:space="preserve">. Dans </w:t>
+        <w:t>, le frontend tente d'être "intelligent" en transformant la valeur de priorité : PRIORITY_</w:t>
       </w:r>
       <w:proofErr w:type="gramStart"/>
       <w:r>
-        <w:t>ce .</w:t>
+        <w:t>LABELS[</w:t>
+      </w:r>
+      <w:proofErr w:type="spellStart"/>
+      <w:proofErr w:type="gramEnd"/>
+      <w:r>
+        <w:t>edit.value.priority</w:t>
+      </w:r>
+      <w:proofErr w:type="spellEnd"/>
+      <w:r>
+        <w:t xml:space="preserve">] || </w:t>
       </w:r>
       <w:proofErr w:type="spellStart"/>
       <w:r>
-        <w:t>env</w:t>
+        <w:t>edit.value.priority</w:t>
+      </w:r>
+      <w:proofErr w:type="spellEnd"/>
+      <w:r>
+        <w:t>. Cela envoie "Moyenne" au lieu de "medium", ce qui échouera systématiquement face à l'énumération stricte du backend (['</w:t>
+      </w:r>
+      <w:proofErr w:type="spellStart"/>
+      <w:r>
+        <w:t>low</w:t>
+      </w:r>
+      <w:proofErr w:type="spellEnd"/>
+      <w:r>
+        <w:t>', 'medium', 'high']).</w:t>
+      </w:r>
+    </w:p>
+    <w:p>
+      <w:pPr>
+        <w:numPr>
+          <w:ilvl w:val="0"/>
+          <w:numId w:val="4"/>
+        </w:numPr>
+        <w:jc w:val="both"/>
+      </w:pPr>
+      <w:r>
+        <w:rPr>
+          <w:b/>
+          <w:bCs/>
+        </w:rPr>
+        <w:t>Optimisation de la base de données (B-05) :</w:t>
+      </w:r>
+      <w:r>
+        <w:t xml:space="preserve"> Dans le contrôleur show, l'utilisation de </w:t>
+      </w:r>
+      <w:proofErr w:type="spellStart"/>
+      <w:r>
+        <w:t>Task.query</w:t>
+      </w:r>
+      <w:proofErr w:type="spellEnd"/>
+      <w:r>
+        <w:t>(</w:t>
+      </w:r>
+      <w:proofErr w:type="gramStart"/>
+      <w:r>
+        <w:t>).</w:t>
+      </w:r>
+      <w:proofErr w:type="spellStart"/>
+      <w:r>
+        <w:t>where</w:t>
       </w:r>
       <w:proofErr w:type="spellEnd"/>
       <w:proofErr w:type="gramEnd"/>
       <w:r>
-        <w:t>, on doit :</w:t>
-      </w:r>
-    </w:p>
-    <w:p>
-      <w:pPr>
-        <w:pStyle w:val="Paragraphedeliste"/>
-        <w:numPr>
-          <w:ilvl w:val="0"/>
-          <w:numId w:val="3"/>
-        </w:numPr>
-      </w:pPr>
-      <w:proofErr w:type="gramStart"/>
-      <w:r>
-        <w:t>générer</w:t>
-      </w:r>
-      <w:proofErr w:type="gramEnd"/>
-      <w:r>
-        <w:t xml:space="preserve"> l’app key avec la commande </w:t>
+        <w:t>(...) sans appeler .first() ou .</w:t>
       </w:r>
       <w:proofErr w:type="spellStart"/>
       <w:r>
-        <w:t>node</w:t>
+        <w:t>firstOrFail</w:t>
       </w:r>
       <w:proofErr w:type="spellEnd"/>
       <w:r>
-        <w:t xml:space="preserve"> ace </w:t>
-      </w:r>
-      <w:proofErr w:type="spellStart"/>
-      <w:r>
-        <w:t>generate:key</w:t>
-      </w:r>
-      <w:proofErr w:type="spellEnd"/>
-      <w:r>
-        <w:t>,</w:t>
-      </w:r>
-    </w:p>
-    <w:p>
-      <w:pPr>
-        <w:pStyle w:val="Paragraphedeliste"/>
-        <w:numPr>
-          <w:ilvl w:val="0"/>
-          <w:numId w:val="3"/>
-        </w:numPr>
-      </w:pPr>
-      <w:proofErr w:type="gramStart"/>
-      <w:r>
-        <w:t>mettre</w:t>
-      </w:r>
-      <w:proofErr w:type="gramEnd"/>
-      <w:r>
-        <w:t xml:space="preserve"> le DB_PORT à 6033,</w:t>
-      </w:r>
-    </w:p>
-    <w:p>
-      <w:pPr>
-        <w:pStyle w:val="Paragraphedeliste"/>
-        <w:numPr>
-          <w:ilvl w:val="0"/>
-          <w:numId w:val="3"/>
-        </w:numPr>
-      </w:pPr>
-      <w:proofErr w:type="gramStart"/>
-      <w:r>
-        <w:t>mettre</w:t>
-      </w:r>
-      <w:proofErr w:type="gramEnd"/>
-      <w:r>
-        <w:t xml:space="preserve"> DB_PASSWORD à root.</w:t>
-      </w:r>
-    </w:p>
-    <w:p>
-      <w:r>
-        <w:t xml:space="preserve">Ensuite, on se place dans le dossier backend et on lancer la commande </w:t>
-      </w:r>
-      <w:proofErr w:type="spellStart"/>
-      <w:r>
-        <w:t>npm</w:t>
-      </w:r>
-      <w:proofErr w:type="spellEnd"/>
-      <w:r>
-        <w:t xml:space="preserve"> </w:t>
-      </w:r>
-      <w:proofErr w:type="spellStart"/>
-      <w:r>
-        <w:t>install</w:t>
-      </w:r>
-      <w:proofErr w:type="spellEnd"/>
-      <w:r>
-        <w:t xml:space="preserve"> afin d’installer les dépendances.</w:t>
+        <w:t>() force le moteur Adonis à retourner une collection (tableau), ce qui est sémantiquement incorrect pour une route récupérant une ressource unique par son ID.</w:t>
       </w:r>
     </w:p>
     <w:p/>
-    <w:p>
-      <w:pPr>
-        <w:pStyle w:val="Titre2"/>
-        <w:numPr>
-          <w:ilvl w:val="0"/>
-          <w:numId w:val="2"/>
-        </w:numPr>
-      </w:pPr>
-      <w:r>
-        <w:t>Configuration du frontend</w:t>
-      </w:r>
-    </w:p>
-    <w:p>
-      <w:r>
-        <w:t xml:space="preserve">Pour la mise en place du frontend, on doit juste se mettre dans le dossier frontend et lancer la commande </w:t>
-      </w:r>
-      <w:proofErr w:type="spellStart"/>
-      <w:r>
-        <w:t>npm</w:t>
-      </w:r>
-      <w:proofErr w:type="spellEnd"/>
-      <w:r>
-        <w:t xml:space="preserve"> </w:t>
-      </w:r>
-      <w:proofErr w:type="spellStart"/>
-      <w:r>
-        <w:t>install</w:t>
-      </w:r>
-      <w:proofErr w:type="spellEnd"/>
-      <w:r>
-        <w:t xml:space="preserve"> comme pour le backend.</w:t>
-      </w:r>
-    </w:p>
     <w:p/>
-    <w:p>
-      <w:pPr>
-        <w:pStyle w:val="Titre2"/>
-        <w:numPr>
-          <w:ilvl w:val="0"/>
-          <w:numId w:val="2"/>
-        </w:numPr>
-      </w:pPr>
-      <w:r>
-        <w:t>Lancement de l’application</w:t>
-      </w:r>
-    </w:p>
-    <w:p>
-      <w:r>
-        <w:t xml:space="preserve">Pour lance l’application, on lance la commande </w:t>
-      </w:r>
-      <w:proofErr w:type="spellStart"/>
-      <w:r>
-        <w:t>npm</w:t>
-      </w:r>
-      <w:proofErr w:type="spellEnd"/>
-      <w:r>
-        <w:t xml:space="preserve"> run dev dans les dossiers frontend et backend et on accède au lien localhost :5173. Si tout se passe bien, on doit voir cela :</w:t>
-      </w:r>
-    </w:p>
-    <w:p>
-      <w:r>
-        <w:lastRenderedPageBreak/>
-        <w:drawing>
-          <wp:inline distT="0" distB="0" distL="0" distR="0" wp14:anchorId="770529D0" wp14:editId="18BA6896">
-            <wp:extent cx="5019675" cy="3031614"/>
-            <wp:effectExtent l="0" t="0" r="0" b="0"/>
-            <wp:docPr id="1459338414" name="Image 1"/>
-            <wp:cNvGraphicFramePr>
-              <a:graphicFrameLocks xmlns:a="http://schemas.openxmlformats.org/drawingml/2006/main" noChangeAspect="1"/>
-            </wp:cNvGraphicFramePr>
-            <a:graphic xmlns:a="http://schemas.openxmlformats.org/drawingml/2006/main">
-              <a:graphicData uri="http://schemas.openxmlformats.org/drawingml/2006/picture">
-                <pic:pic xmlns:pic="http://schemas.openxmlformats.org/drawingml/2006/picture">
-                  <pic:nvPicPr>
-                    <pic:cNvPr id="1459338414" name=""/>
-                    <pic:cNvPicPr/>
-                  </pic:nvPicPr>
-                  <pic:blipFill>
-                    <a:blip r:embed="rId5">
-                      <a:extLst>
-                        <a:ext uri="{28A0092B-C50C-407E-A947-70E740481C1C}">
-                          <a14:useLocalDpi xmlns:a14="http://schemas.microsoft.com/office/drawing/2010/main" val="0"/>
-                        </a:ext>
-                      </a:extLst>
-                    </a:blip>
-                    <a:stretch>
-                      <a:fillRect/>
-                    </a:stretch>
-                  </pic:blipFill>
-                  <pic:spPr>
-                    <a:xfrm>
-                      <a:off x="0" y="0"/>
-                      <a:ext cx="5022412" cy="3033267"/>
-                    </a:xfrm>
-                    <a:prstGeom prst="rect">
-                      <a:avLst/>
-                    </a:prstGeom>
-                  </pic:spPr>
-                </pic:pic>
-              </a:graphicData>
-            </a:graphic>
-          </wp:inline>
-        </w:drawing>
-      </w:r>
-    </w:p>
     <w:sectPr>
       <w:pgSz w:w="11906" w:h="16838"/>
       <w:pgMar w:top="1417" w:right="1417" w:bottom="1417" w:left="1417" w:header="708" w:footer="708" w:gutter="0"/>
@@ -518,6 +3339,119 @@
     </w:lvl>
   </w:abstractNum>
   <w:abstractNum w:abstractNumId="2" w15:restartNumberingAfterBreak="0">
+    <w:nsid w:val="32F6453F"/>
+    <w:multiLevelType w:val="multilevel"/>
+    <w:tmpl w:val="683E7FE6"/>
+    <w:lvl w:ilvl="0">
+      <w:start w:val="1"/>
+      <w:numFmt w:val="decimal"/>
+      <w:lvlText w:val="%1."/>
+      <w:lvlJc w:val="left"/>
+      <w:pPr>
+        <w:tabs>
+          <w:tab w:val="num" w:pos="720"/>
+        </w:tabs>
+        <w:ind w:left="720" w:hanging="360"/>
+      </w:pPr>
+    </w:lvl>
+    <w:lvl w:ilvl="1" w:tentative="1">
+      <w:start w:val="1"/>
+      <w:numFmt w:val="decimal"/>
+      <w:lvlText w:val="%2."/>
+      <w:lvlJc w:val="left"/>
+      <w:pPr>
+        <w:tabs>
+          <w:tab w:val="num" w:pos="1440"/>
+        </w:tabs>
+        <w:ind w:left="1440" w:hanging="360"/>
+      </w:pPr>
+    </w:lvl>
+    <w:lvl w:ilvl="2" w:tentative="1">
+      <w:start w:val="1"/>
+      <w:numFmt w:val="decimal"/>
+      <w:lvlText w:val="%3."/>
+      <w:lvlJc w:val="left"/>
+      <w:pPr>
+        <w:tabs>
+          <w:tab w:val="num" w:pos="2160"/>
+        </w:tabs>
+        <w:ind w:left="2160" w:hanging="360"/>
+      </w:pPr>
+    </w:lvl>
+    <w:lvl w:ilvl="3" w:tentative="1">
+      <w:start w:val="1"/>
+      <w:numFmt w:val="decimal"/>
+      <w:lvlText w:val="%4."/>
+      <w:lvlJc w:val="left"/>
+      <w:pPr>
+        <w:tabs>
+          <w:tab w:val="num" w:pos="2880"/>
+        </w:tabs>
+        <w:ind w:left="2880" w:hanging="360"/>
+      </w:pPr>
+    </w:lvl>
+    <w:lvl w:ilvl="4" w:tentative="1">
+      <w:start w:val="1"/>
+      <w:numFmt w:val="decimal"/>
+      <w:lvlText w:val="%5."/>
+      <w:lvlJc w:val="left"/>
+      <w:pPr>
+        <w:tabs>
+          <w:tab w:val="num" w:pos="3600"/>
+        </w:tabs>
+        <w:ind w:left="3600" w:hanging="360"/>
+      </w:pPr>
+    </w:lvl>
+    <w:lvl w:ilvl="5" w:tentative="1">
+      <w:start w:val="1"/>
+      <w:numFmt w:val="decimal"/>
+      <w:lvlText w:val="%6."/>
+      <w:lvlJc w:val="left"/>
+      <w:pPr>
+        <w:tabs>
+          <w:tab w:val="num" w:pos="4320"/>
+        </w:tabs>
+        <w:ind w:left="4320" w:hanging="360"/>
+      </w:pPr>
+    </w:lvl>
+    <w:lvl w:ilvl="6" w:tentative="1">
+      <w:start w:val="1"/>
+      <w:numFmt w:val="decimal"/>
+      <w:lvlText w:val="%7."/>
+      <w:lvlJc w:val="left"/>
+      <w:pPr>
+        <w:tabs>
+          <w:tab w:val="num" w:pos="5040"/>
+        </w:tabs>
+        <w:ind w:left="5040" w:hanging="360"/>
+      </w:pPr>
+    </w:lvl>
+    <w:lvl w:ilvl="7" w:tentative="1">
+      <w:start w:val="1"/>
+      <w:numFmt w:val="decimal"/>
+      <w:lvlText w:val="%8."/>
+      <w:lvlJc w:val="left"/>
+      <w:pPr>
+        <w:tabs>
+          <w:tab w:val="num" w:pos="5760"/>
+        </w:tabs>
+        <w:ind w:left="5760" w:hanging="360"/>
+      </w:pPr>
+    </w:lvl>
+    <w:lvl w:ilvl="8" w:tentative="1">
+      <w:start w:val="1"/>
+      <w:numFmt w:val="decimal"/>
+      <w:lvlText w:val="%9."/>
+      <w:lvlJc w:val="left"/>
+      <w:pPr>
+        <w:tabs>
+          <w:tab w:val="num" w:pos="6480"/>
+        </w:tabs>
+        <w:ind w:left="6480" w:hanging="360"/>
+      </w:pPr>
+    </w:lvl>
+  </w:abstractNum>
+  <w:abstractNum w:abstractNumId="3" w15:restartNumberingAfterBreak="0">
     <w:nsid w:val="345F6DA0"/>
     <w:multiLevelType w:val="hybridMultilevel"/>
     <w:tmpl w:val="7786DCB4"/>
@@ -610,10 +3544,13 @@
     <w:abstractNumId w:val="0"/>
   </w:num>
   <w:num w:numId="2" w16cid:durableId="1751342210">
-    <w:abstractNumId w:val="2"/>
+    <w:abstractNumId w:val="3"/>
   </w:num>
   <w:num w:numId="3" w16cid:durableId="1614558261">
     <w:abstractNumId w:val="1"/>
+  </w:num>
+  <w:num w:numId="4" w16cid:durableId="141625887">
+    <w:abstractNumId w:val="2"/>
   </w:num>
 </w:numbering>
 </file>

</xml_diff>